<commit_message>
remove: testconfigurator, add docx
</commit_message>
<xml_diff>
--- a/src/templates/Angebot-AH-alt-3.docx
+++ b/src/templates/Angebot-AH-alt-3.docx
@@ -3,7 +3,7 @@
 <w:document xmlns:o="urn:schemas-microsoft-com:office:office" xmlns:r="http://schemas.openxmlformats.org/officeDocument/2006/relationships" xmlns:v="urn:schemas-microsoft-com:vml" xmlns:w="http://schemas.openxmlformats.org/wordprocessingml/2006/main" xmlns:w10="urn:schemas-microsoft-com:office:word" xmlns:wp="http://schemas.openxmlformats.org/drawingml/2006/wordprocessingDrawing" xmlns:pic="http://schemas.openxmlformats.org/drawingml/2006/picture" xmlns:wps="http://schemas.microsoft.com/office/word/2010/wordprocessingShape" xmlns:wpg="http://schemas.microsoft.com/office/word/2010/wordprocessingGroup" xmlns:mc="http://schemas.openxmlformats.org/markup-compatibility/2006" xmlns:wp14="http://schemas.microsoft.com/office/word/2010/wordprocessingDrawing" xmlns:w14="http://schemas.microsoft.com/office/word/2010/wordml" xmlns:w15="http://schemas.microsoft.com/office/word/2012/wordml" mc:Ignorable="w14 wp14 w15">
   <w:background w:color="FFFFFF"/>
   <w:body>
-    <w:p xmlns:wp14="http://schemas.microsoft.com/office/word/2010/wordml" wp14:textId="77777777">
+    <w:p>
       <w:pPr>
         <w:pStyle w:val="Normal"/>
         <w:spacing w:before="171" w:after="40"/>
@@ -24,7 +24,7 @@
         <w:t>EmC2 Soziale Dienste UG (haftungsbeschränkt) • Waldstraße 5 • 95032 Hof</w:t>
       </w:r>
     </w:p>
-    <w:p xmlns:wp14="http://schemas.microsoft.com/office/word/2010/wordml" wp14:textId="77777777">
+    <w:p>
       <w:pPr>
         <w:pStyle w:val="Normal"/>
         <w:spacing w:before="0" w:after="265"/>
@@ -44,7 +44,7 @@
         </w:rPr>
       </w:r>
     </w:p>
-    <w:p xmlns:wp14="http://schemas.microsoft.com/office/word/2010/wordml" wp14:textId="77777777">
+    <w:p>
       <w:pPr>
         <w:pStyle w:val="Normal"/>
         <w:spacing w:before="0" w:after="20"/>
@@ -65,7 +65,7 @@
         <w:t>{Anrede}</w:t>
       </w:r>
     </w:p>
-    <w:p xmlns:wp14="http://schemas.microsoft.com/office/word/2010/wordml" wp14:textId="77777777">
+    <w:p>
       <w:pPr>
         <w:pStyle w:val="Normal"/>
         <w:spacing w:before="0" w:after="20"/>
@@ -88,7 +88,7 @@
         <w:t>{Vorname} {Nachname}</w:t>
       </w:r>
     </w:p>
-    <w:p xmlns:wp14="http://schemas.microsoft.com/office/word/2010/wordml" wp14:textId="77777777">
+    <w:p>
       <w:pPr>
         <w:pStyle w:val="Normal"/>
         <w:spacing w:before="0" w:after="20"/>
@@ -109,7 +109,7 @@
         <w:t>{Adresse}</w:t>
       </w:r>
     </w:p>
-    <w:p xmlns:wp14="http://schemas.microsoft.com/office/word/2010/wordml" wp14:textId="77777777">
+    <w:p>
       <w:pPr>
         <w:pStyle w:val="Normal"/>
         <w:spacing w:before="0" w:after="20"/>
@@ -130,7 +130,7 @@
         <w:t>{PLZ} {Stadt}</w:t>
       </w:r>
     </w:p>
-    <w:p xmlns:wp14="http://schemas.microsoft.com/office/word/2010/wordml" wp14:textId="77777777">
+    <w:p>
       <w:pPr>
         <w:pStyle w:val="Normal"/>
         <w:spacing w:before="0" w:after="0"/>
@@ -168,19 +168,19 @@
         <w:gridCol w:w="1677"/>
         <w:gridCol w:w="2634"/>
       </w:tblGrid>
-      <w:tr xmlns:wp14="http://schemas.microsoft.com/office/word/2010/wordml" wp14:textId="77777777">
+      <w:tr>
         <w:trPr/>
         <w:tc>
           <w:tcPr>
             <w:tcW w:w="1677" w:type="dxa"/>
             <w:tcBorders>
-              <w:top w:val="single" w:color="FFFFFF" w:sz="8" w:space="0"/>
-              <w:left w:val="single" w:color="FFFFFF" w:sz="8" w:space="0"/>
-              <w:bottom w:val="single" w:color="FFFFFF" w:sz="8" w:space="0"/>
-              <w:right w:val="single" w:color="FFFFFF" w:sz="8" w:space="0"/>
+              <w:top w:val="single" w:sz="8" w:space="0" w:color="FFFFFF"/>
+              <w:left w:val="single" w:sz="8" w:space="0" w:color="FFFFFF"/>
+              <w:bottom w:val="single" w:sz="8" w:space="0" w:color="FFFFFF"/>
+              <w:right w:val="single" w:sz="8" w:space="0" w:color="FFFFFF"/>
             </w:tcBorders>
           </w:tcPr>
-          <w:p wp14:textId="77777777">
+          <w:p>
             <w:pPr>
               <w:pStyle w:val="Normal"/>
               <w:suppressAutoHyphens w:val="true"/>
@@ -210,13 +210,13 @@
           <w:tcPr>
             <w:tcW w:w="2634" w:type="dxa"/>
             <w:tcBorders>
-              <w:top w:val="single" w:color="FFFFFF" w:sz="8" w:space="0"/>
-              <w:left w:val="single" w:color="FFFFFF" w:sz="8" w:space="0"/>
-              <w:bottom w:val="single" w:color="FFFFFF" w:sz="8" w:space="0"/>
-              <w:right w:val="single" w:color="FFFFFF" w:sz="8" w:space="0"/>
+              <w:top w:val="single" w:sz="8" w:space="0" w:color="FFFFFF"/>
+              <w:left w:val="single" w:sz="8" w:space="0" w:color="FFFFFF"/>
+              <w:bottom w:val="single" w:sz="8" w:space="0" w:color="FFFFFF"/>
+              <w:right w:val="single" w:sz="8" w:space="0" w:color="FFFFFF"/>
             </w:tcBorders>
           </w:tcPr>
-          <w:p wp14:textId="77777777">
+          <w:p>
             <w:pPr>
               <w:pStyle w:val="Normal"/>
               <w:suppressAutoHyphens w:val="true"/>
@@ -243,19 +243,19 @@
           </w:p>
         </w:tc>
       </w:tr>
-      <w:tr xmlns:wp14="http://schemas.microsoft.com/office/word/2010/wordml" wp14:textId="77777777">
+      <w:tr>
         <w:trPr/>
         <w:tc>
           <w:tcPr>
             <w:tcW w:w="1677" w:type="dxa"/>
             <w:tcBorders>
-              <w:top w:val="single" w:color="FFFFFF" w:sz="8" w:space="0"/>
-              <w:left w:val="single" w:color="FFFFFF" w:sz="8" w:space="0"/>
-              <w:bottom w:val="single" w:color="FFFFFF" w:sz="8" w:space="0"/>
-              <w:right w:val="single" w:color="FFFFFF" w:sz="8" w:space="0"/>
+              <w:top w:val="single" w:sz="8" w:space="0" w:color="FFFFFF"/>
+              <w:left w:val="single" w:sz="8" w:space="0" w:color="FFFFFF"/>
+              <w:bottom w:val="single" w:sz="8" w:space="0" w:color="FFFFFF"/>
+              <w:right w:val="single" w:sz="8" w:space="0" w:color="FFFFFF"/>
             </w:tcBorders>
           </w:tcPr>
-          <w:p wp14:textId="77777777">
+          <w:p>
             <w:pPr>
               <w:pStyle w:val="Normal"/>
               <w:suppressAutoHyphens w:val="true"/>
@@ -285,13 +285,13 @@
           <w:tcPr>
             <w:tcW w:w="2634" w:type="dxa"/>
             <w:tcBorders>
-              <w:top w:val="single" w:color="FFFFFF" w:sz="8" w:space="0"/>
-              <w:left w:val="single" w:color="FFFFFF" w:sz="8" w:space="0"/>
-              <w:bottom w:val="single" w:color="FFFFFF" w:sz="8" w:space="0"/>
-              <w:right w:val="single" w:color="FFFFFF" w:sz="8" w:space="0"/>
+              <w:top w:val="single" w:sz="8" w:space="0" w:color="FFFFFF"/>
+              <w:left w:val="single" w:sz="8" w:space="0" w:color="FFFFFF"/>
+              <w:bottom w:val="single" w:sz="8" w:space="0" w:color="FFFFFF"/>
+              <w:right w:val="single" w:sz="8" w:space="0" w:color="FFFFFF"/>
             </w:tcBorders>
           </w:tcPr>
-          <w:p wp14:textId="77777777">
+          <w:p>
             <w:pPr>
               <w:pStyle w:val="Normal"/>
               <w:suppressAutoHyphens w:val="true"/>
@@ -318,19 +318,19 @@
           </w:p>
         </w:tc>
       </w:tr>
-      <w:tr xmlns:wp14="http://schemas.microsoft.com/office/word/2010/wordml" wp14:textId="77777777">
+      <w:tr>
         <w:trPr/>
         <w:tc>
           <w:tcPr>
             <w:tcW w:w="1677" w:type="dxa"/>
             <w:tcBorders>
-              <w:top w:val="single" w:color="FFFFFF" w:sz="8" w:space="0"/>
-              <w:left w:val="single" w:color="FFFFFF" w:sz="8" w:space="0"/>
-              <w:bottom w:val="single" w:color="FFFFFF" w:sz="8" w:space="0"/>
-              <w:right w:val="single" w:color="FFFFFF" w:sz="8" w:space="0"/>
+              <w:top w:val="single" w:sz="8" w:space="0" w:color="FFFFFF"/>
+              <w:left w:val="single" w:sz="8" w:space="0" w:color="FFFFFF"/>
+              <w:bottom w:val="single" w:sz="8" w:space="0" w:color="FFFFFF"/>
+              <w:right w:val="single" w:sz="8" w:space="0" w:color="FFFFFF"/>
             </w:tcBorders>
           </w:tcPr>
-          <w:p wp14:textId="77777777">
+          <w:p>
             <w:pPr>
               <w:pStyle w:val="Normal"/>
               <w:suppressAutoHyphens w:val="true"/>
@@ -360,13 +360,13 @@
           <w:tcPr>
             <w:tcW w:w="2634" w:type="dxa"/>
             <w:tcBorders>
-              <w:top w:val="single" w:color="FFFFFF" w:sz="8" w:space="0"/>
-              <w:left w:val="single" w:color="FFFFFF" w:sz="8" w:space="0"/>
-              <w:bottom w:val="single" w:color="FFFFFF" w:sz="8" w:space="0"/>
-              <w:right w:val="single" w:color="FFFFFF" w:sz="8" w:space="0"/>
+              <w:top w:val="single" w:sz="8" w:space="0" w:color="FFFFFF"/>
+              <w:left w:val="single" w:sz="8" w:space="0" w:color="FFFFFF"/>
+              <w:bottom w:val="single" w:sz="8" w:space="0" w:color="FFFFFF"/>
+              <w:right w:val="single" w:sz="8" w:space="0" w:color="FFFFFF"/>
             </w:tcBorders>
           </w:tcPr>
-          <w:p wp14:textId="77777777">
+          <w:p>
             <w:pPr>
               <w:pStyle w:val="Normal"/>
               <w:suppressAutoHyphens w:val="true"/>
@@ -393,19 +393,19 @@
           </w:p>
         </w:tc>
       </w:tr>
-      <w:tr xmlns:wp14="http://schemas.microsoft.com/office/word/2010/wordml" wp14:textId="77777777">
+      <w:tr>
         <w:trPr/>
         <w:tc>
           <w:tcPr>
             <w:tcW w:w="1677" w:type="dxa"/>
             <w:tcBorders>
-              <w:top w:val="single" w:color="FFFFFF" w:sz="8" w:space="0"/>
-              <w:left w:val="single" w:color="FFFFFF" w:sz="8" w:space="0"/>
-              <w:bottom w:val="single" w:color="FFFFFF" w:sz="8" w:space="0"/>
-              <w:right w:val="single" w:color="FFFFFF" w:sz="8" w:space="0"/>
+              <w:top w:val="single" w:sz="8" w:space="0" w:color="FFFFFF"/>
+              <w:left w:val="single" w:sz="8" w:space="0" w:color="FFFFFF"/>
+              <w:bottom w:val="single" w:sz="8" w:space="0" w:color="FFFFFF"/>
+              <w:right w:val="single" w:sz="8" w:space="0" w:color="FFFFFF"/>
             </w:tcBorders>
           </w:tcPr>
-          <w:p wp14:textId="77777777">
+          <w:p>
             <w:pPr>
               <w:pStyle w:val="Normal"/>
               <w:suppressAutoHyphens w:val="true"/>
@@ -435,13 +435,13 @@
           <w:tcPr>
             <w:tcW w:w="2634" w:type="dxa"/>
             <w:tcBorders>
-              <w:top w:val="single" w:color="FFFFFF" w:sz="8" w:space="0"/>
-              <w:left w:val="single" w:color="FFFFFF" w:sz="8" w:space="0"/>
-              <w:bottom w:val="single" w:color="FFFFFF" w:sz="8" w:space="0"/>
-              <w:right w:val="single" w:color="FFFFFF" w:sz="8" w:space="0"/>
+              <w:top w:val="single" w:sz="8" w:space="0" w:color="FFFFFF"/>
+              <w:left w:val="single" w:sz="8" w:space="0" w:color="FFFFFF"/>
+              <w:bottom w:val="single" w:sz="8" w:space="0" w:color="FFFFFF"/>
+              <w:right w:val="single" w:sz="8" w:space="0" w:color="FFFFFF"/>
             </w:tcBorders>
           </w:tcPr>
-          <w:p wp14:textId="77777777">
+          <w:p>
             <w:pPr>
               <w:pStyle w:val="Normal"/>
               <w:suppressAutoHyphens w:val="true"/>
@@ -469,7 +469,7 @@
         </w:tc>
       </w:tr>
     </w:tbl>
-    <w:p xmlns:wp14="http://schemas.microsoft.com/office/word/2010/wordml" wp14:textId="77777777">
+    <w:p>
       <w:pPr>
         <w:pStyle w:val="Normal"/>
         <w:spacing w:before="0" w:after="120"/>
@@ -489,7 +489,7 @@
         </w:rPr>
       </w:r>
     </w:p>
-    <w:p xmlns:wp14="http://schemas.microsoft.com/office/word/2010/wordml" wp14:textId="77777777">
+    <w:p>
       <w:pPr>
         <w:pStyle w:val="Normal"/>
         <w:spacing w:before="0" w:after="80"/>
@@ -512,7 +512,7 @@
         <w:t>Ihr Angebot für Hilfe im Haushalt</w:t>
       </w:r>
     </w:p>
-    <w:p xmlns:wp14="http://schemas.microsoft.com/office/word/2010/wordml" wp14:textId="77777777">
+    <w:p>
       <w:pPr>
         <w:pStyle w:val="Normal"/>
         <w:spacing w:before="0" w:after="80"/>
@@ -533,7 +533,7 @@
         <w:t>{Greeting} {Nachname},</w:t>
       </w:r>
     </w:p>
-    <w:p xmlns:wp14="http://schemas.microsoft.com/office/word/2010/wordml" wp14:textId="77777777">
+    <w:p>
       <w:pPr>
         <w:pStyle w:val="Normal"/>
         <w:spacing w:before="0" w:after="20"/>
@@ -554,7 +554,7 @@
         <w:t>vielen Dank für Ihre Anfrage und Ihr damit verbundenes Interesse.</w:t>
       </w:r>
     </w:p>
-    <w:p xmlns:wp14="http://schemas.microsoft.com/office/word/2010/wordml" wp14:textId="77777777">
+    <w:p>
       <w:pPr>
         <w:pStyle w:val="Normal"/>
         <w:spacing w:before="0" w:after="120"/>
@@ -588,30 +588,30 @@
           <w:bottom w:w="60" w:type="dxa"/>
           <w:right w:w="60" w:type="dxa"/>
         </w:tblCellMar>
-        <w:tblLook w:val="04a0" w:firstRow="1" w:lastRow="0" w:firstColumn="1" w:lastColumn="0" w:noHBand="0" w:noVBand="1"/>
+        <w:tblLook w:val="04a0" w:noVBand="1" w:noHBand="0" w:lastColumn="0" w:firstColumn="1" w:lastRow="0" w:firstRow="1"/>
       </w:tblPr>
       <w:tblGrid>
         <w:gridCol w:w="463"/>
         <w:gridCol w:w="5036"/>
-        <w:gridCol w:w="976"/>
-        <w:gridCol w:w="1573"/>
+        <w:gridCol w:w="975"/>
+        <w:gridCol w:w="1574"/>
         <w:gridCol w:w="1"/>
         <w:gridCol w:w="1305"/>
       </w:tblGrid>
-      <w:tr xmlns:wp14="http://schemas.microsoft.com/office/word/2010/wordml" wp14:textId="77777777">
+      <w:tr>
         <w:trPr/>
         <w:tc>
           <w:tcPr>
             <w:tcW w:w="463" w:type="dxa"/>
             <w:tcBorders>
-              <w:top w:val="single" w:color="333333" w:sz="6" w:space="0"/>
-              <w:left w:val="single" w:color="333333" w:sz="6" w:space="0"/>
-              <w:bottom w:val="single" w:color="333333" w:sz="6" w:space="0"/>
-              <w:right w:val="single" w:color="333333" w:sz="6" w:space="0"/>
+              <w:top w:val="single" w:sz="6" w:space="0" w:color="333333"/>
+              <w:left w:val="single" w:sz="6" w:space="0" w:color="333333"/>
+              <w:bottom w:val="single" w:sz="6" w:space="0" w:color="333333"/>
+              <w:right w:val="single" w:sz="6" w:space="0" w:color="333333"/>
             </w:tcBorders>
-            <w:shd w:val="clear" w:color="auto" w:fill="E8E8E8"/>
+            <w:shd w:color="auto" w:fill="E8E8E8" w:val="clear"/>
           </w:tcPr>
-          <w:p wp14:textId="77777777">
+          <w:p>
             <w:pPr>
               <w:pStyle w:val="Normal"/>
               <w:suppressAutoHyphens w:val="true"/>
@@ -643,14 +643,14 @@
           <w:tcPr>
             <w:tcW w:w="5036" w:type="dxa"/>
             <w:tcBorders>
-              <w:top w:val="single" w:color="333333" w:sz="6" w:space="0"/>
-              <w:left w:val="single" w:color="333333" w:sz="6" w:space="0"/>
-              <w:bottom w:val="single" w:color="333333" w:sz="6" w:space="0"/>
-              <w:right w:val="single" w:color="333333" w:sz="6" w:space="0"/>
+              <w:top w:val="single" w:sz="6" w:space="0" w:color="333333"/>
+              <w:left w:val="single" w:sz="6" w:space="0" w:color="333333"/>
+              <w:bottom w:val="single" w:sz="6" w:space="0" w:color="333333"/>
+              <w:right w:val="single" w:sz="6" w:space="0" w:color="333333"/>
             </w:tcBorders>
-            <w:shd w:val="clear" w:color="auto" w:fill="E8E8E8"/>
+            <w:shd w:color="auto" w:fill="E8E8E8" w:val="clear"/>
           </w:tcPr>
-          <w:p wp14:textId="77777777">
+          <w:p>
             <w:pPr>
               <w:pStyle w:val="Normal"/>
               <w:suppressAutoHyphens w:val="true"/>
@@ -680,16 +680,16 @@
         </w:tc>
         <w:tc>
           <w:tcPr>
-            <w:tcW w:w="976" w:type="dxa"/>
+            <w:tcW w:w="975" w:type="dxa"/>
             <w:tcBorders>
-              <w:top w:val="single" w:color="333333" w:sz="6" w:space="0"/>
-              <w:left w:val="single" w:color="333333" w:sz="6" w:space="0"/>
-              <w:bottom w:val="single" w:color="333333" w:sz="6" w:space="0"/>
-              <w:right w:val="single" w:color="333333" w:sz="6" w:space="0"/>
+              <w:top w:val="single" w:sz="6" w:space="0" w:color="333333"/>
+              <w:left w:val="single" w:sz="6" w:space="0" w:color="333333"/>
+              <w:bottom w:val="single" w:sz="6" w:space="0" w:color="333333"/>
+              <w:right w:val="single" w:sz="6" w:space="0" w:color="333333"/>
             </w:tcBorders>
-            <w:shd w:val="clear" w:color="auto" w:fill="E8E8E8"/>
+            <w:shd w:color="auto" w:fill="E8E8E8" w:val="clear"/>
           </w:tcPr>
-          <w:p wp14:textId="77777777">
+          <w:p>
             <w:pPr>
               <w:pStyle w:val="Normal"/>
               <w:suppressAutoHyphens w:val="true"/>
@@ -719,17 +719,17 @@
         </w:tc>
         <w:tc>
           <w:tcPr>
-            <w:tcW w:w="1574" w:type="dxa"/>
+            <w:tcW w:w="1575" w:type="dxa"/>
             <w:gridSpan w:val="2"/>
             <w:tcBorders>
-              <w:top w:val="single" w:color="333333" w:sz="6" w:space="0"/>
-              <w:left w:val="single" w:color="333333" w:sz="6" w:space="0"/>
-              <w:bottom w:val="single" w:color="333333" w:sz="6" w:space="0"/>
-              <w:right w:val="single" w:color="333333" w:sz="6" w:space="0"/>
+              <w:top w:val="single" w:sz="6" w:space="0" w:color="333333"/>
+              <w:left w:val="single" w:sz="6" w:space="0" w:color="333333"/>
+              <w:bottom w:val="single" w:sz="6" w:space="0" w:color="333333"/>
+              <w:right w:val="single" w:sz="6" w:space="0" w:color="333333"/>
             </w:tcBorders>
-            <w:shd w:val="clear" w:color="auto" w:fill="E8E8E8"/>
+            <w:shd w:color="auto" w:fill="E8E8E8" w:val="clear"/>
           </w:tcPr>
-          <w:p wp14:textId="77777777">
+          <w:p>
             <w:pPr>
               <w:pStyle w:val="Normal"/>
               <w:suppressAutoHyphens w:val="true"/>
@@ -761,14 +761,14 @@
           <w:tcPr>
             <w:tcW w:w="1305" w:type="dxa"/>
             <w:tcBorders>
-              <w:top w:val="single" w:color="333333" w:sz="6" w:space="0"/>
-              <w:left w:val="single" w:color="333333" w:sz="6" w:space="0"/>
-              <w:bottom w:val="single" w:color="333333" w:sz="6" w:space="0"/>
-              <w:right w:val="single" w:color="333333" w:sz="6" w:space="0"/>
+              <w:top w:val="single" w:sz="6" w:space="0" w:color="333333"/>
+              <w:left w:val="single" w:sz="6" w:space="0" w:color="333333"/>
+              <w:bottom w:val="single" w:sz="6" w:space="0" w:color="333333"/>
+              <w:right w:val="single" w:sz="6" w:space="0" w:color="333333"/>
             </w:tcBorders>
-            <w:shd w:val="clear" w:color="auto" w:fill="E8E8E8"/>
+            <w:shd w:color="auto" w:fill="E8E8E8" w:val="clear"/>
           </w:tcPr>
-          <w:p wp14:textId="77777777">
+          <w:p>
             <w:pPr>
               <w:pStyle w:val="Normal"/>
               <w:suppressAutoHyphens w:val="true"/>
@@ -797,19 +797,19 @@
           </w:p>
         </w:tc>
       </w:tr>
-      <w:tr xmlns:wp14="http://schemas.microsoft.com/office/word/2010/wordml" wp14:textId="77777777">
+      <w:tr>
         <w:trPr/>
         <w:tc>
           <w:tcPr>
             <w:tcW w:w="463" w:type="dxa"/>
             <w:tcBorders>
-              <w:top w:val="single" w:color="333333" w:sz="6" w:space="0"/>
-              <w:left w:val="single" w:color="333333" w:sz="6" w:space="0"/>
-              <w:bottom w:val="single" w:color="333333" w:sz="6" w:space="0"/>
-              <w:right w:val="single" w:color="333333" w:sz="6" w:space="0"/>
+              <w:top w:val="single" w:sz="6" w:space="0" w:color="333333"/>
+              <w:left w:val="single" w:sz="6" w:space="0" w:color="333333"/>
+              <w:bottom w:val="single" w:sz="6" w:space="0" w:color="333333"/>
+              <w:right w:val="single" w:sz="6" w:space="0" w:color="333333"/>
             </w:tcBorders>
           </w:tcPr>
-          <w:p wp14:textId="77777777">
+          <w:p>
             <w:pPr>
               <w:pStyle w:val="Normal"/>
               <w:suppressAutoHyphens w:val="true"/>
@@ -839,13 +839,13 @@
           <w:tcPr>
             <w:tcW w:w="5036" w:type="dxa"/>
             <w:tcBorders>
-              <w:top w:val="single" w:color="333333" w:sz="6" w:space="0"/>
-              <w:left w:val="single" w:color="333333" w:sz="6" w:space="0"/>
-              <w:bottom w:val="single" w:color="333333" w:sz="6" w:space="0"/>
-              <w:right w:val="single" w:color="333333" w:sz="6" w:space="0"/>
+              <w:top w:val="single" w:sz="6" w:space="0" w:color="333333"/>
+              <w:left w:val="single" w:sz="6" w:space="0" w:color="333333"/>
+              <w:bottom w:val="single" w:sz="6" w:space="0" w:color="333333"/>
+              <w:right w:val="single" w:sz="6" w:space="0" w:color="333333"/>
             </w:tcBorders>
           </w:tcPr>
-          <w:p wp14:textId="77777777">
+          <w:p>
             <w:pPr>
               <w:pStyle w:val="Normal"/>
               <w:suppressAutoHyphens w:val="true"/>
@@ -872,7 +872,7 @@
               <w:t>Anfahrtspauschale Alltagshilfe</w:t>
             </w:r>
           </w:p>
-          <w:p wp14:textId="77777777">
+          <w:p>
             <w:pPr>
               <w:pStyle w:val="Normal"/>
               <w:suppressAutoHyphens w:val="true"/>
@@ -900,15 +900,15 @@
         </w:tc>
         <w:tc>
           <w:tcPr>
-            <w:tcW w:w="976" w:type="dxa"/>
+            <w:tcW w:w="975" w:type="dxa"/>
             <w:tcBorders>
-              <w:top w:val="single" w:color="333333" w:sz="6" w:space="0"/>
-              <w:left w:val="single" w:color="333333" w:sz="6" w:space="0"/>
-              <w:bottom w:val="single" w:color="333333" w:sz="6" w:space="0"/>
-              <w:right w:val="single" w:color="333333" w:sz="6" w:space="0"/>
+              <w:top w:val="single" w:sz="6" w:space="0" w:color="333333"/>
+              <w:left w:val="single" w:sz="6" w:space="0" w:color="333333"/>
+              <w:bottom w:val="single" w:sz="6" w:space="0" w:color="333333"/>
+              <w:right w:val="single" w:sz="6" w:space="0" w:color="333333"/>
             </w:tcBorders>
           </w:tcPr>
-          <w:p wp14:textId="77777777">
+          <w:p>
             <w:pPr>
               <w:pStyle w:val="Normal"/>
               <w:suppressAutoHyphens w:val="true"/>
@@ -936,16 +936,16 @@
         </w:tc>
         <w:tc>
           <w:tcPr>
-            <w:tcW w:w="1574" w:type="dxa"/>
+            <w:tcW w:w="1575" w:type="dxa"/>
             <w:gridSpan w:val="2"/>
             <w:tcBorders>
-              <w:top w:val="single" w:color="333333" w:sz="6" w:space="0"/>
-              <w:left w:val="single" w:color="333333" w:sz="6" w:space="0"/>
-              <w:bottom w:val="single" w:color="333333" w:sz="6" w:space="0"/>
-              <w:right w:val="single" w:color="333333" w:sz="6" w:space="0"/>
+              <w:top w:val="single" w:sz="6" w:space="0" w:color="333333"/>
+              <w:left w:val="single" w:sz="6" w:space="0" w:color="333333"/>
+              <w:bottom w:val="single" w:sz="6" w:space="0" w:color="333333"/>
+              <w:right w:val="single" w:sz="6" w:space="0" w:color="333333"/>
             </w:tcBorders>
           </w:tcPr>
-          <w:p wp14:textId="77777777">
+          <w:p>
             <w:pPr>
               <w:pStyle w:val="Normal"/>
               <w:suppressAutoHyphens w:val="true"/>
@@ -975,13 +975,13 @@
           <w:tcPr>
             <w:tcW w:w="1305" w:type="dxa"/>
             <w:tcBorders>
-              <w:top w:val="single" w:color="333333" w:sz="6" w:space="0"/>
-              <w:left w:val="single" w:color="333333" w:sz="6" w:space="0"/>
-              <w:bottom w:val="single" w:color="333333" w:sz="6" w:space="0"/>
-              <w:right w:val="single" w:color="333333" w:sz="6" w:space="0"/>
+              <w:top w:val="single" w:sz="6" w:space="0" w:color="333333"/>
+              <w:left w:val="single" w:sz="6" w:space="0" w:color="333333"/>
+              <w:bottom w:val="single" w:sz="6" w:space="0" w:color="333333"/>
+              <w:right w:val="single" w:sz="6" w:space="0" w:color="333333"/>
             </w:tcBorders>
           </w:tcPr>
-          <w:p wp14:textId="77777777">
+          <w:p>
             <w:pPr>
               <w:pStyle w:val="Normal"/>
               <w:suppressAutoHyphens w:val="true"/>
@@ -1010,19 +1010,19 @@
           </w:p>
         </w:tc>
       </w:tr>
-      <w:tr xmlns:wp14="http://schemas.microsoft.com/office/word/2010/wordml" wp14:textId="77777777">
+      <w:tr>
         <w:trPr/>
         <w:tc>
           <w:tcPr>
             <w:tcW w:w="463" w:type="dxa"/>
             <w:tcBorders>
-              <w:top w:val="single" w:color="333333" w:sz="6" w:space="0"/>
-              <w:left w:val="single" w:color="333333" w:sz="6" w:space="0"/>
-              <w:bottom w:val="single" w:color="333333" w:sz="6" w:space="0"/>
-              <w:right w:val="single" w:color="333333" w:sz="6" w:space="0"/>
+              <w:top w:val="single" w:sz="6" w:space="0" w:color="333333"/>
+              <w:left w:val="single" w:sz="6" w:space="0" w:color="333333"/>
+              <w:bottom w:val="single" w:sz="6" w:space="0" w:color="333333"/>
+              <w:right w:val="single" w:sz="6" w:space="0" w:color="333333"/>
             </w:tcBorders>
           </w:tcPr>
-          <w:p wp14:textId="77777777">
+          <w:p>
             <w:pPr>
               <w:pStyle w:val="Normal"/>
               <w:suppressAutoHyphens w:val="true"/>
@@ -1052,13 +1052,13 @@
           <w:tcPr>
             <w:tcW w:w="5036" w:type="dxa"/>
             <w:tcBorders>
-              <w:top w:val="single" w:color="333333" w:sz="6" w:space="0"/>
-              <w:left w:val="single" w:color="333333" w:sz="6" w:space="0"/>
-              <w:bottom w:val="single" w:color="333333" w:sz="6" w:space="0"/>
-              <w:right w:val="single" w:color="333333" w:sz="6" w:space="0"/>
+              <w:top w:val="single" w:sz="6" w:space="0" w:color="333333"/>
+              <w:left w:val="single" w:sz="6" w:space="0" w:color="333333"/>
+              <w:bottom w:val="single" w:sz="6" w:space="0" w:color="333333"/>
+              <w:right w:val="single" w:sz="6" w:space="0" w:color="333333"/>
             </w:tcBorders>
           </w:tcPr>
-          <w:p wp14:textId="77777777">
+          <w:p>
             <w:pPr>
               <w:pStyle w:val="Normal"/>
               <w:suppressAutoHyphens w:val="true"/>
@@ -1085,7 +1085,7 @@
               <w:t>{AhServiceTitle}</w:t>
             </w:r>
           </w:p>
-          <w:p wp14:textId="77777777">
+          <w:p>
             <w:pPr>
               <w:pStyle w:val="Normal"/>
               <w:suppressAutoHyphens w:val="true"/>
@@ -1111,7 +1111,7 @@
               <w:t>{AhServiceSubtitle}</w:t>
             </w:r>
           </w:p>
-          <w:p wp14:textId="77777777">
+          <w:p>
             <w:pPr>
               <w:pStyle w:val="Normal"/>
               <w:suppressAutoHyphens w:val="true"/>
@@ -1139,15 +1139,15 @@
         </w:tc>
         <w:tc>
           <w:tcPr>
-            <w:tcW w:w="976" w:type="dxa"/>
+            <w:tcW w:w="975" w:type="dxa"/>
             <w:tcBorders>
-              <w:top w:val="single" w:color="333333" w:sz="6" w:space="0"/>
-              <w:left w:val="single" w:color="333333" w:sz="6" w:space="0"/>
-              <w:bottom w:val="single" w:color="333333" w:sz="6" w:space="0"/>
-              <w:right w:val="single" w:color="333333" w:sz="6" w:space="0"/>
+              <w:top w:val="single" w:sz="6" w:space="0" w:color="333333"/>
+              <w:left w:val="single" w:sz="6" w:space="0" w:color="333333"/>
+              <w:bottom w:val="single" w:sz="6" w:space="0" w:color="333333"/>
+              <w:right w:val="single" w:sz="6" w:space="0" w:color="333333"/>
             </w:tcBorders>
           </w:tcPr>
-          <w:p wp14:textId="77777777">
+          <w:p>
             <w:pPr>
               <w:pStyle w:val="Normal"/>
               <w:suppressAutoHyphens w:val="true"/>
@@ -1175,16 +1175,16 @@
         </w:tc>
         <w:tc>
           <w:tcPr>
-            <w:tcW w:w="1574" w:type="dxa"/>
+            <w:tcW w:w="1575" w:type="dxa"/>
             <w:gridSpan w:val="2"/>
             <w:tcBorders>
-              <w:top w:val="single" w:color="333333" w:sz="6" w:space="0"/>
-              <w:left w:val="single" w:color="333333" w:sz="6" w:space="0"/>
-              <w:bottom w:val="single" w:color="333333" w:sz="6" w:space="0"/>
-              <w:right w:val="single" w:color="333333" w:sz="6" w:space="0"/>
+              <w:top w:val="single" w:sz="6" w:space="0" w:color="333333"/>
+              <w:left w:val="single" w:sz="6" w:space="0" w:color="333333"/>
+              <w:bottom w:val="single" w:sz="6" w:space="0" w:color="333333"/>
+              <w:right w:val="single" w:sz="6" w:space="0" w:color="333333"/>
             </w:tcBorders>
           </w:tcPr>
-          <w:p wp14:textId="77777777">
+          <w:p>
             <w:pPr>
               <w:pStyle w:val="Normal"/>
               <w:suppressAutoHyphens w:val="true"/>
@@ -1214,13 +1214,13 @@
           <w:tcPr>
             <w:tcW w:w="1305" w:type="dxa"/>
             <w:tcBorders>
-              <w:top w:val="single" w:color="333333" w:sz="6" w:space="0"/>
-              <w:left w:val="single" w:color="333333" w:sz="6" w:space="0"/>
-              <w:bottom w:val="single" w:color="333333" w:sz="6" w:space="0"/>
-              <w:right w:val="single" w:color="333333" w:sz="6" w:space="0"/>
+              <w:top w:val="single" w:sz="6" w:space="0" w:color="333333"/>
+              <w:left w:val="single" w:sz="6" w:space="0" w:color="333333"/>
+              <w:bottom w:val="single" w:sz="6" w:space="0" w:color="333333"/>
+              <w:right w:val="single" w:sz="6" w:space="0" w:color="333333"/>
             </w:tcBorders>
           </w:tcPr>
-          <w:p wp14:textId="77777777">
+          <w:p>
             <w:pPr>
               <w:pStyle w:val="Normal"/>
               <w:suppressAutoHyphens w:val="true"/>
@@ -1249,21 +1249,21 @@
           </w:p>
         </w:tc>
       </w:tr>
-      <w:tr xmlns:wp14="http://schemas.microsoft.com/office/word/2010/wordml" wp14:textId="77777777">
+      <w:tr>
         <w:trPr/>
         <w:tc>
           <w:tcPr>
             <w:tcW w:w="8048" w:type="dxa"/>
             <w:gridSpan w:val="4"/>
             <w:tcBorders>
-              <w:top w:val="single" w:color="333333" w:sz="6" w:space="0"/>
-              <w:left w:val="single" w:color="333333" w:sz="6" w:space="0"/>
-              <w:bottom w:val="single" w:color="333333" w:sz="6" w:space="0"/>
-              <w:right w:val="single" w:color="333333" w:sz="6" w:space="0"/>
+              <w:top w:val="single" w:sz="6" w:space="0" w:color="333333"/>
+              <w:left w:val="single" w:sz="6" w:space="0" w:color="333333"/>
+              <w:bottom w:val="single" w:sz="6" w:space="0" w:color="333333"/>
+              <w:right w:val="single" w:sz="6" w:space="0" w:color="333333"/>
             </w:tcBorders>
-            <w:shd w:val="clear" w:color="auto" w:fill="EEEEEE"/>
+            <w:shd w:color="auto" w:fill="EEEEEE" w:val="clear"/>
           </w:tcPr>
-          <w:p wp14:textId="77777777">
+          <w:p>
             <w:pPr>
               <w:pStyle w:val="Normal"/>
               <w:suppressAutoHyphens w:val="true"/>
@@ -1296,14 +1296,14 @@
             <w:tcW w:w="1306" w:type="dxa"/>
             <w:gridSpan w:val="2"/>
             <w:tcBorders>
-              <w:top w:val="single" w:color="333333" w:sz="6" w:space="0"/>
-              <w:left w:val="single" w:color="333333" w:sz="6" w:space="0"/>
-              <w:bottom w:val="single" w:color="333333" w:sz="6" w:space="0"/>
-              <w:right w:val="single" w:color="333333" w:sz="6" w:space="0"/>
+              <w:top w:val="single" w:sz="6" w:space="0" w:color="333333"/>
+              <w:left w:val="single" w:sz="6" w:space="0" w:color="333333"/>
+              <w:bottom w:val="single" w:sz="6" w:space="0" w:color="333333"/>
+              <w:right w:val="single" w:sz="6" w:space="0" w:color="333333"/>
             </w:tcBorders>
-            <w:shd w:val="clear" w:color="auto" w:fill="EEEEEE"/>
+            <w:shd w:color="auto" w:fill="EEEEEE" w:val="clear"/>
           </w:tcPr>
-          <w:p wp14:textId="77777777">
+          <w:p>
             <w:pPr>
               <w:pStyle w:val="Normal"/>
               <w:suppressAutoHyphens w:val="true"/>
@@ -1333,7 +1333,7 @@
         </w:tc>
       </w:tr>
     </w:tbl>
-    <w:p xmlns:wp14="http://schemas.microsoft.com/office/word/2010/wordml" wp14:textId="77777777">
+    <w:p>
       <w:pPr>
         <w:pStyle w:val="Normal"/>
         <w:spacing w:before="0" w:after="60"/>
@@ -1353,7 +1353,7 @@
         </w:rPr>
       </w:r>
     </w:p>
-    <w:p xmlns:wp14="http://schemas.microsoft.com/office/word/2010/wordml" wp14:textId="77777777">
+    <w:p>
       <w:pPr>
         <w:pStyle w:val="Normal"/>
         <w:spacing w:before="0" w:after="40"/>
@@ -1375,78 +1375,7 @@
         <w:t>{AhNote}</w:t>
       </w:r>
     </w:p>
-    <w:p xmlns:wp14="http://schemas.microsoft.com/office/word/2010/wordml" wp14:textId="77777777">
-      <w:pPr>
-        <w:pStyle w:val="Normal"/>
-        <w:widowControl/>
-        <w:spacing w:before="0" w:after="0"/>
-        <w:ind w:left="0" w:right="0" w:hanging="0"/>
-        <w:jc w:val="both"/>
-        <w:rPr>
-          <w:rFonts w:ascii="Open Sans" w:hAnsi="Open Sans"/>
-          <w:b w:val="false"/>
-          <w:i w:val="false"/>
-          <w:i w:val="false"/>
-          <w:caps w:val="false"/>
-          <w:smallCaps w:val="false"/>
-          <w:color w:val="000000"/>
-          <w:spacing w:val="0"/>
-          <w:sz w:val="17"/>
-          <w:szCs w:val="17"/>
-        </w:rPr>
-      </w:pPr>
-      <w:r>
-        <w:rPr>
-          <w:b w:val="false"/>
-          <w:i w:val="false"/>
-          <w:caps w:val="false"/>
-          <w:smallCaps w:val="false"/>
-          <w:color w:val="000000"/>
-          <w:spacing w:val="0"/>
-          <w:sz w:val="17"/>
-          <w:szCs w:val="17"/>
-        </w:rPr>
-        <w:t>{#AhShowAbHinweis}Zusätzlich können Sie eine Alltagsbegleitung buchen – zum Stundensatz von 53,04 €, zuzüglich einer Anfahrtspauschale von 7,96 € sowie 0,35 € pro gefahrenem Kilometer. Bei Bedarf wenden Sie sich bitte an unsere Koordination Alltagshilfe.{/AhShowAbHinweis}</w:t>
-      </w:r>
-    </w:p>
-    <w:p xmlns:wp14="http://schemas.microsoft.com/office/word/2010/wordml" wp14:textId="77777777">
-      <w:pPr>
-        <w:pStyle w:val="Normal"/>
-        <w:widowControl/>
-        <w:spacing w:before="0" w:after="0"/>
-        <w:ind w:left="0" w:right="0" w:hanging="0"/>
-        <w:jc w:val="both"/>
-        <w:rPr>
-          <w:rFonts w:ascii="Open Sans" w:hAnsi="Open Sans"/>
-          <w:b w:val="false"/>
-          <w:i w:val="false"/>
-          <w:i w:val="false"/>
-          <w:caps w:val="false"/>
-          <w:smallCaps w:val="false"/>
-          <w:color w:val="000000"/>
-          <w:spacing w:val="0"/>
-          <w:sz w:val="17"/>
-          <w:szCs w:val="17"/>
-        </w:rPr>
-      </w:pPr>
-      <w:r>
-        <w:rPr>
-          <w:b w:val="false"/>
-          <w:i w:val="false"/>
-          <w:caps w:val="false"/>
-          <w:smallCaps w:val="false"/>
-          <w:color w:val="000000"/>
-          <w:spacing w:val="0"/>
-          <w:sz w:val="17"/>
-          <w:szCs w:val="17"/>
-        </w:rPr>
-        <w:t>{#AhShowHndHinweis}Zusätzlich können Sie haushaltsnahe Dienstleistungen buchen – zum Stundensatz von 40,56 €, zuzüglich einer Anfahrtspauschale von 7,96 €. Bei Bedarf wenden Sie sich bitte an unsere Koordination Alltagshilfe.{/AhShowHndHinweis}</w:t>
-      </w:r>
-      <w:r>
-        <w:br w:type="page"/>
-      </w:r>
-    </w:p>
-    <w:p xmlns:wp14="http://schemas.microsoft.com/office/word/2010/wordml" wp14:textId="77777777">
+    <w:p>
       <w:pPr>
         <w:pStyle w:val="Normal"/>
         <w:spacing w:before="0" w:after="80"/>
@@ -1482,25 +1411,25 @@
           <w:bottom w:w="80" w:type="dxa"/>
           <w:right w:w="80" w:type="dxa"/>
         </w:tblCellMar>
-        <w:tblLook w:val="04a0" w:firstRow="1" w:lastRow="0" w:firstColumn="1" w:lastColumn="0" w:noHBand="0" w:noVBand="1"/>
+        <w:tblLook w:val="04a0" w:noVBand="1" w:noHBand="0" w:lastColumn="0" w:firstColumn="1" w:lastRow="0" w:firstRow="1"/>
       </w:tblPr>
       <w:tblGrid>
         <w:gridCol w:w="6058"/>
         <w:gridCol w:w="3295"/>
       </w:tblGrid>
-      <w:tr xmlns:wp14="http://schemas.microsoft.com/office/word/2010/wordml" wp14:textId="77777777">
+      <w:tr>
         <w:trPr/>
         <w:tc>
           <w:tcPr>
             <w:tcW w:w="6058" w:type="dxa"/>
             <w:tcBorders>
-              <w:top w:val="single" w:color="333333" w:sz="6" w:space="0"/>
-              <w:left w:val="single" w:color="333333" w:sz="6" w:space="0"/>
-              <w:bottom w:val="single" w:color="333333" w:sz="6" w:space="0"/>
-              <w:right w:val="single" w:color="333333" w:sz="6" w:space="0"/>
+              <w:top w:val="single" w:sz="6" w:space="0" w:color="333333"/>
+              <w:left w:val="single" w:sz="6" w:space="0" w:color="333333"/>
+              <w:bottom w:val="single" w:sz="6" w:space="0" w:color="333333"/>
+              <w:right w:val="single" w:sz="6" w:space="0" w:color="333333"/>
             </w:tcBorders>
           </w:tcPr>
-          <w:p wp14:textId="77777777">
+          <w:p>
             <w:pPr>
               <w:pStyle w:val="Normal"/>
               <w:suppressAutoHyphens w:val="true"/>
@@ -1530,13 +1459,13 @@
           <w:tcPr>
             <w:tcW w:w="3295" w:type="dxa"/>
             <w:tcBorders>
-              <w:top w:val="single" w:color="333333" w:sz="6" w:space="0"/>
-              <w:left w:val="single" w:color="333333" w:sz="6" w:space="0"/>
-              <w:bottom w:val="single" w:color="333333" w:sz="6" w:space="0"/>
-              <w:right w:val="single" w:color="333333" w:sz="6" w:space="0"/>
+              <w:top w:val="single" w:sz="6" w:space="0" w:color="333333"/>
+              <w:left w:val="single" w:sz="6" w:space="0" w:color="333333"/>
+              <w:bottom w:val="single" w:sz="6" w:space="0" w:color="333333"/>
+              <w:right w:val="single" w:sz="6" w:space="0" w:color="333333"/>
             </w:tcBorders>
           </w:tcPr>
-          <w:p wp14:textId="77777777">
+          <w:p>
             <w:pPr>
               <w:pStyle w:val="Normal"/>
               <w:suppressAutoHyphens w:val="true"/>
@@ -1564,7 +1493,7 @@
         </w:tc>
       </w:tr>
     </w:tbl>
-    <w:p xmlns:wp14="http://schemas.microsoft.com/office/word/2010/wordml" wp14:textId="77777777">
+    <w:p>
       <w:pPr>
         <w:pStyle w:val="Normal"/>
         <w:spacing w:before="0" w:after="160"/>
@@ -1584,7 +1513,7 @@
         </w:rPr>
       </w:r>
     </w:p>
-    <w:p xmlns:wp14="http://schemas.microsoft.com/office/word/2010/wordml" wp14:textId="77777777">
+    <w:p>
       <w:pPr>
         <w:pStyle w:val="Normal"/>
         <w:spacing w:before="0" w:after="80"/>
@@ -1603,27 +1532,11 @@
           <w:szCs w:val="17"/>
         </w:rPr>
         <w:t>Bitte unterschreiben Sie bei Annahme dieses Angebots und schicken Sie es uns zurück – gerne auch per E-Mail an service@e-m-c-2.de. Die Unterschrift gilt für uns als Auftragsbestätigung.</w:t>
-      </w:r>
-      <w:r>
-        <w:rPr>
-          <w:rFonts w:eastAsia="Open Sans" w:cs="Open Sans"/>
-          <w:color w:val="070707"/>
-          <w:sz w:val="17"/>
-          <w:szCs w:val="17"/>
-        </w:rPr>
         <w:br/>
-      </w:r>
-      <w:r>
-        <w:rPr>
-          <w:rFonts w:eastAsia="Open Sans" w:cs="Open Sans"/>
-          <w:color w:val="070707"/>
-          <w:sz w:val="17"/>
-          <w:szCs w:val="17"/>
-        </w:rPr>
         <w:br/>
       </w:r>
     </w:p>
-    <w:p xmlns:wp14="http://schemas.microsoft.com/office/word/2010/wordml" wp14:textId="77777777">
+    <w:p>
       <w:pPr>
         <w:pStyle w:val="Normal"/>
         <w:spacing w:before="0" w:after="240"/>
@@ -1642,23 +1555,7 @@
           <w:szCs w:val="17"/>
         </w:rPr>
         <w:t>Angebot akzeptiert / Auftrag bestätigt:</w:t>
-      </w:r>
-      <w:r>
-        <w:rPr>
-          <w:rFonts w:eastAsia="Open Sans" w:cs="Open Sans"/>
-          <w:color w:val="070707"/>
-          <w:sz w:val="17"/>
-          <w:szCs w:val="17"/>
-        </w:rPr>
         <w:br/>
-      </w:r>
-      <w:r>
-        <w:rPr>
-          <w:rFonts w:eastAsia="Open Sans" w:cs="Open Sans"/>
-          <w:color w:val="070707"/>
-          <w:sz w:val="17"/>
-          <w:szCs w:val="17"/>
-        </w:rPr>
         <w:br/>
       </w:r>
     </w:p>
@@ -1675,29 +1572,31 @@
           <w:bottom w:w="10" w:type="dxa"/>
           <w:right w:w="10" w:type="dxa"/>
         </w:tblCellMar>
-        <w:tblLook w:val="04a0" w:firstRow="1" w:lastRow="0" w:firstColumn="1" w:lastColumn="0" w:noHBand="0" w:noVBand="1"/>
+        <w:tblLook w:val="04a0" w:noVBand="1" w:noHBand="0" w:lastColumn="0" w:firstColumn="1" w:lastRow="0" w:firstRow="1"/>
       </w:tblPr>
       <w:tblGrid>
         <w:gridCol w:w="5126"/>
         <w:gridCol w:w="4227"/>
       </w:tblGrid>
-      <w:tr xmlns:wp14="http://schemas.microsoft.com/office/word/2010/wordml" wp14:textId="77777777">
-        <w:trPr/>
+      <w:tr>
+        <w:trPr>
+          <w:trHeight w:val="447" w:hRule="atLeast"/>
+        </w:trPr>
         <w:tc>
           <w:tcPr>
             <w:tcW w:w="5126" w:type="dxa"/>
             <w:tcBorders>
-              <w:top w:val="single" w:color="FFFFFF" w:sz="8" w:space="0"/>
-              <w:left w:val="single" w:color="FFFFFF" w:sz="8" w:space="0"/>
-              <w:bottom w:val="single" w:color="FFFFFF" w:sz="8" w:space="0"/>
-              <w:right w:val="single" w:color="FFFFFF" w:sz="8" w:space="0"/>
+              <w:top w:val="single" w:sz="8" w:space="0" w:color="FFFFFF"/>
+              <w:left w:val="single" w:sz="8" w:space="0" w:color="FFFFFF"/>
+              <w:bottom w:val="single" w:sz="8" w:space="0" w:color="FFFFFF"/>
+              <w:right w:val="single" w:sz="8" w:space="0" w:color="FFFFFF"/>
             </w:tcBorders>
           </w:tcPr>
-          <w:p wp14:textId="77777777">
+          <w:p>
             <w:pPr>
               <w:pStyle w:val="Normal"/>
               <w:pBdr>
-                <w:top w:val="single" w:color="333333" w:sz="6" w:space="1"/>
+                <w:top w:val="single" w:sz="6" w:space="1" w:color="333333"/>
               </w:pBdr>
               <w:suppressAutoHyphens w:val="true"/>
               <w:spacing w:before="0" w:after="60"/>
@@ -1727,13 +1626,13 @@
           <w:tcPr>
             <w:tcW w:w="4227" w:type="dxa"/>
             <w:tcBorders>
-              <w:top w:val="single" w:color="FFFFFF" w:sz="8" w:space="0"/>
-              <w:left w:val="single" w:color="FFFFFF" w:sz="8" w:space="0"/>
-              <w:bottom w:val="single" w:color="FFFFFF" w:sz="8" w:space="0"/>
-              <w:right w:val="single" w:color="FFFFFF" w:sz="8" w:space="0"/>
+              <w:top w:val="single" w:sz="8" w:space="0" w:color="FFFFFF"/>
+              <w:left w:val="single" w:sz="8" w:space="0" w:color="FFFFFF"/>
+              <w:bottom w:val="single" w:sz="8" w:space="0" w:color="FFFFFF"/>
+              <w:right w:val="single" w:sz="8" w:space="0" w:color="FFFFFF"/>
             </w:tcBorders>
           </w:tcPr>
-          <w:p wp14:textId="77777777">
+          <w:p>
             <w:pPr>
               <w:pStyle w:val="Normal"/>
               <w:suppressAutoHyphens w:val="true"/>
@@ -1758,27 +1657,7 @@
         </w:tc>
       </w:tr>
     </w:tbl>
-    <w:p xmlns:wp14="http://schemas.microsoft.com/office/word/2010/wordml" wp14:textId="77777777">
-      <w:pPr>
-        <w:pStyle w:val="Normal"/>
-        <w:spacing w:before="0" w:after="160"/>
-        <w:rPr>
-          <w:rFonts w:ascii="Open Sans" w:hAnsi="Open Sans" w:eastAsia="Open Sans" w:cs="Open Sans"/>
-          <w:color w:val="070707"/>
-          <w:sz w:val="17"/>
-          <w:szCs w:val="17"/>
-        </w:rPr>
-      </w:pPr>
-      <w:r>
-        <w:rPr>
-          <w:rFonts w:eastAsia="Open Sans" w:cs="Open Sans"/>
-          <w:color w:val="070707"/>
-          <w:sz w:val="17"/>
-          <w:szCs w:val="17"/>
-        </w:rPr>
-      </w:r>
-    </w:p>
-    <w:p xmlns:wp14="http://schemas.microsoft.com/office/word/2010/wordml" wp14:textId="77777777">
+    <w:p>
       <w:pPr>
         <w:pStyle w:val="Normal"/>
         <w:spacing w:before="0" w:after="40"/>
@@ -1799,7 +1678,7 @@
         <w:t>Bei Rückfragen stehen wir Ihnen jederzeit gerne zur Verfügung.</w:t>
       </w:r>
     </w:p>
-    <w:p xmlns:wp14="http://schemas.microsoft.com/office/word/2010/wordml" wp14:textId="77777777">
+    <w:p>
       <w:pPr>
         <w:pStyle w:val="Normal"/>
         <w:spacing w:before="0" w:after="120"/>
@@ -1819,6 +1698,58 @@
         </w:rPr>
         <w:t>Wir bedanken uns für Ihr Vertrauen und freuen uns von Ihnen zu hören!</w:t>
       </w:r>
+    </w:p>
+    <w:p>
+      <w:pPr>
+        <w:pStyle w:val="Normal"/>
+        <w:widowControl/>
+        <w:spacing w:before="0" w:after="0"/>
+        <w:ind w:hanging="0" w:left="0" w:right="0"/>
+        <w:jc w:val="both"/>
+        <w:rPr>
+          <w:sz w:val="17"/>
+          <w:szCs w:val="17"/>
+        </w:rPr>
+      </w:pPr>
+      <w:r>
+        <w:rPr>
+          <w:b w:val="false"/>
+          <w:i w:val="false"/>
+          <w:caps w:val="false"/>
+          <w:smallCaps w:val="false"/>
+          <w:color w:val="000000"/>
+          <w:spacing w:val="0"/>
+          <w:sz w:val="17"/>
+          <w:szCs w:val="17"/>
+        </w:rPr>
+        <w:t>{#AhShowAbHinweis}Zusätzlich können Sie eine Alltagsbegleitung buchen – zum Stundensatz von 53,04 €, zuzüglich einer Anfahrtspauschale von 7,96 € sowie 0,35 € pro gefahrenem Kilometer. Bei Bedarf wenden Sie sich bitte an unsere Koordination Alltagshilfe.{/AhShowAbHinweis}</w:t>
+      </w:r>
+    </w:p>
+    <w:p>
+      <w:pPr>
+        <w:pStyle w:val="Normal"/>
+        <w:spacing w:before="0" w:after="120"/>
+        <w:rPr>
+          <w:rFonts w:ascii="Open Sans" w:hAnsi="Open Sans" w:eastAsia="Open Sans" w:cs="Open Sans"/>
+          <w:color w:val="070707"/>
+          <w:sz w:val="17"/>
+          <w:szCs w:val="17"/>
+        </w:rPr>
+      </w:pPr>
+      <w:r>
+        <w:rPr>
+          <w:rFonts w:eastAsia="Open Sans" w:cs="Open Sans"/>
+          <w:b w:val="false"/>
+          <w:i w:val="false"/>
+          <w:caps w:val="false"/>
+          <w:smallCaps w:val="false"/>
+          <w:color w:val="000000"/>
+          <w:spacing w:val="0"/>
+          <w:sz w:val="17"/>
+          <w:szCs w:val="17"/>
+        </w:rPr>
+        <w:t>{#AhShowHndHinweis}Zusätzlich können Sie haushaltsnahe Dienstleistungen buchen – zum Stundensatz von 40,56 €, zuzüglich einer Anfahrtspauschale von 7,96 €. Bei Bedarf wenden Sie sich bitte an unsere Koordination Alltagshilfe.{/AhShowHndHinweis}</w:t>
+      </w:r>
       <w:r>
         <w:rPr>
           <w:rFonts w:eastAsia="Open Sans" w:cs="Open Sans"/>
@@ -1829,7 +1760,7 @@
         <w:br/>
       </w:r>
     </w:p>
-    <w:p xmlns:wp14="http://schemas.microsoft.com/office/word/2010/wordml" wp14:textId="77777777">
+    <w:p>
       <w:pPr>
         <w:pStyle w:val="Normal"/>
         <w:spacing w:before="0" w:after="20"/>
@@ -1848,27 +1779,11 @@
           <w:szCs w:val="17"/>
         </w:rPr>
         <w:t>Mit freundlichen Grüßen,</w:t>
-      </w:r>
-      <w:r>
-        <w:rPr>
-          <w:rFonts w:eastAsia="Open Sans" w:cs="Open Sans"/>
-          <w:color w:val="070707"/>
-          <w:sz w:val="17"/>
-          <w:szCs w:val="17"/>
-        </w:rPr>
         <w:br/>
-      </w:r>
-      <w:r>
-        <w:rPr>
-          <w:rFonts w:eastAsia="Open Sans" w:cs="Open Sans"/>
-          <w:color w:val="070707"/>
-          <w:sz w:val="17"/>
-          <w:szCs w:val="17"/>
-        </w:rPr>
         <w:br/>
       </w:r>
     </w:p>
-    <w:p xmlns:wp14="http://schemas.microsoft.com/office/word/2010/wordml" wp14:textId="77777777">
+    <w:p>
       <w:pPr>
         <w:pStyle w:val="Normal"/>
         <w:spacing w:before="0" w:after="20"/>
@@ -1889,7 +1804,7 @@
         <w:t>Ihr Team von der EmC2</w:t>
       </w:r>
     </w:p>
-    <w:p xmlns:wp14="http://schemas.microsoft.com/office/word/2010/wordml" wp14:textId="77777777">
+    <w:p>
       <w:pPr>
         <w:pStyle w:val="Normal"/>
         <w:spacing w:before="0" w:after="60"/>
@@ -1913,13 +1828,12 @@
       <w:footerReference w:type="default" r:id="rId6"/>
       <w:footerReference w:type="first" r:id="rId7"/>
       <w:type w:val="nextPage"/>
-      <w:pgSz w:w="11906" w:h="16838" w:orient="portrait"/>
-      <w:pgMar w:top="1418" w:right="1134" w:bottom="720" w:left="1418" w:header="340" w:footer="340" w:gutter="0"/>
-      <w:pgNumType w:fmt="decimal" w:start="1"/>
+      <w:pgSz w:w="11906" w:h="16838"/>
+      <w:pgMar w:left="1418" w:right="1134" w:gutter="0" w:header="340" w:top="1418" w:footer="340" w:bottom="720"/>
+      <w:pgNumType w:start="1" w:fmt="decimal"/>
       <w:formProt w:val="false"/>
       <w:textDirection w:val="lrTb"/>
       <w:docGrid w:type="default" w:linePitch="100" w:charSpace="4096"/>
-      <w:cols w:num="1"/>
     </w:sectPr>
   </w:body>
 </w:document>
@@ -1927,7 +1841,7 @@
 
 <file path=word/footer1.xml><?xml version="1.0" encoding="utf-8"?>
 <w:ftr xmlns:o="urn:schemas-microsoft-com:office:office" xmlns:r="http://schemas.openxmlformats.org/officeDocument/2006/relationships" xmlns:v="urn:schemas-microsoft-com:vml" xmlns:w="http://schemas.openxmlformats.org/wordprocessingml/2006/main" xmlns:w10="urn:schemas-microsoft-com:office:word" xmlns:wp="http://schemas.openxmlformats.org/drawingml/2006/wordprocessingDrawing" xmlns:pic="http://schemas.openxmlformats.org/drawingml/2006/picture" xmlns:wps="http://schemas.microsoft.com/office/word/2010/wordprocessingShape" xmlns:wpg="http://schemas.microsoft.com/office/word/2010/wordprocessingGroup" xmlns:mc="http://schemas.openxmlformats.org/markup-compatibility/2006" xmlns:wp14="http://schemas.microsoft.com/office/word/2010/wordprocessingDrawing" xmlns:w14="http://schemas.microsoft.com/office/word/2010/wordml" xmlns:w15="http://schemas.microsoft.com/office/word/2012/wordml" mc:Ignorable="w14 wp14 w15">
-  <w:p xmlns:wp14="http://schemas.microsoft.com/office/word/2010/wordml" wp14:textId="77777777">
+  <w:p>
     <w:pPr>
       <w:pStyle w:val="Footer"/>
       <w:rPr/>
@@ -1953,61 +1867,40 @@
         <w:bottom w:w="55" w:type="dxa"/>
         <w:right w:w="55" w:type="dxa"/>
       </w:tblCellMar>
-      <w:tblLook w:val="0600" w:firstRow="0" w:lastRow="0" w:firstColumn="0" w:lastColumn="0" w:noHBand="1" w:noVBand="1"/>
+      <w:tblLook w:val="0600" w:noVBand="1" w:noHBand="1" w:lastColumn="0" w:firstColumn="0" w:lastRow="0" w:firstRow="0"/>
     </w:tblPr>
     <w:tblGrid>
       <w:gridCol w:w="3118"/>
-      <w:gridCol w:w="3125"/>
-      <w:gridCol w:w="3111"/>
+      <w:gridCol w:w="3124"/>
+      <w:gridCol w:w="3112"/>
     </w:tblGrid>
-    <w:tr xmlns:wp14="http://schemas.microsoft.com/office/word/2010/wordml" wp14:textId="77777777">
+    <w:tr>
       <w:trPr>
-        <w:trHeight w:val="665"/>
+        <w:trHeight w:val="665" w:hRule="atLeast"/>
       </w:trPr>
       <w:tc>
         <w:tcPr>
           <w:tcW w:w="3118" w:type="dxa"/>
           <w:tcBorders>
-            <w:top w:val="single" w:color="2E74B5" w:themeColor="accent5" w:themeShade="BF" w:sz="18"/>
+            <w:top w:val="single" w:sz="18" w:space="0" w:color="2E74B5"/>
           </w:tcBorders>
-          <w:tcMar/>
           <w:vAlign w:val="center"/>
         </w:tcPr>
-        <w:p wp14:textId="143B2CAC">
+        <w:p>
           <w:pPr>
             <w:pStyle w:val="TableContents"/>
             <w:jc w:val="center"/>
+            <w:rPr/>
           </w:pPr>
           <w:r>
             <w:rPr>
               <w:sz w:val="15"/>
               <w:szCs w:val="15"/>
             </w:rPr>
-            <w:t xml:space="preserve">emc2 </w:t>
-          </w:r>
-          <w:r>
-            <w:rPr>
-              <w:sz w:val="15"/>
-              <w:szCs w:val="15"/>
-            </w:rPr>
-            <w:t>Atilla</w:t>
-          </w:r>
-          <w:r>
-            <w:rPr>
-              <w:sz w:val="15"/>
-              <w:szCs w:val="15"/>
-            </w:rPr>
-            <w:t xml:space="preserve"> </w:t>
-          </w:r>
-          <w:r>
-            <w:rPr>
-              <w:sz w:val="15"/>
-              <w:szCs w:val="15"/>
-            </w:rPr>
-            <w:t>Landgrafe</w:t>
+            <w:t>emc2 Atilla Landgrafe</w:t>
           </w:r>
         </w:p>
-        <w:p wp14:textId="77777777">
+        <w:p>
           <w:pPr>
             <w:pStyle w:val="TableContents"/>
             <w:jc w:val="center"/>
@@ -2024,7 +1917,7 @@
             <w:t>Waldstraße 5</w:t>
           </w:r>
         </w:p>
-        <w:p wp14:textId="77777777">
+        <w:p>
           <w:pPr>
             <w:pStyle w:val="TableContents"/>
             <w:jc w:val="center"/>
@@ -2041,7 +1934,7 @@
             <w:t>95032 Hof</w:t>
           </w:r>
         </w:p>
-        <w:p wp14:textId="3AEFA044">
+        <w:p>
           <w:pPr>
             <w:pStyle w:val="TableContents"/>
             <w:jc w:val="center"/>
@@ -2061,16 +1954,16 @@
       </w:tc>
       <w:tc>
         <w:tcPr>
-          <w:tcW w:w="3125" w:type="dxa"/>
+          <w:tcW w:w="3124" w:type="dxa"/>
           <w:tcBorders>
-            <w:top w:val="single" w:color="2E74B5" w:themeColor="accent5" w:themeShade="BF" w:sz="18"/>
+            <w:top w:val="single" w:sz="18" w:space="0" w:color="2E74B5"/>
           </w:tcBorders>
-          <w:tcMar/>
         </w:tcPr>
-        <w:p wp14:textId="0B3E02AF">
+        <w:p>
           <w:pPr>
             <w:pStyle w:val="TableContents"/>
             <w:jc w:val="center"/>
+            <w:rPr/>
           </w:pPr>
           <w:r>
             <w:rPr>
@@ -2080,7 +1973,7 @@
             <w:t>Tel.: 09281 5915900</w:t>
           </w:r>
         </w:p>
-        <w:p wp14:textId="77777777">
+        <w:p>
           <w:pPr>
             <w:pStyle w:val="TableContents"/>
             <w:jc w:val="center"/>
@@ -2094,17 +1987,10 @@
               <w:sz w:val="15"/>
               <w:szCs w:val="15"/>
             </w:rPr>
-            <w:t>Fax.: 09281 591590</w:t>
-          </w:r>
-          <w:r>
-            <w:rPr>
-              <w:sz w:val="15"/>
-              <w:szCs w:val="15"/>
-            </w:rPr>
-            <w:t>9</w:t>
+            <w:t>Fax.: 09281 5915909</w:t>
           </w:r>
         </w:p>
-        <w:p wp14:textId="38B0198F">
+        <w:p>
           <w:pPr>
             <w:pStyle w:val="TableContents"/>
             <w:jc w:val="center"/>
@@ -2121,7 +2007,7 @@
             <w:t>Email: kontakt@e-m-c-2.de</w:t>
           </w:r>
         </w:p>
-        <w:p wp14:textId="59FFB098">
+        <w:p>
           <w:pPr>
             <w:pStyle w:val="TableContents"/>
             <w:jc w:val="center"/>
@@ -2141,40 +2027,26 @@
       </w:tc>
       <w:tc>
         <w:tcPr>
-          <w:tcW w:w="3111" w:type="dxa"/>
+          <w:tcW w:w="3112" w:type="dxa"/>
           <w:tcBorders>
-            <w:top w:val="single" w:color="2E74B5" w:themeColor="accent5" w:themeShade="BF" w:sz="18"/>
+            <w:top w:val="single" w:sz="18" w:space="0" w:color="2E74B5"/>
           </w:tcBorders>
-          <w:tcMar/>
         </w:tcPr>
-        <w:p wp14:textId="2369C166">
+        <w:p>
           <w:pPr>
             <w:pStyle w:val="TableContents"/>
             <w:jc w:val="center"/>
+            <w:rPr/>
           </w:pPr>
           <w:r>
             <w:rPr>
               <w:sz w:val="15"/>
               <w:szCs w:val="15"/>
             </w:rPr>
-            <w:t>Hof</w:t>
-          </w:r>
-          <w:r>
-            <w:rPr>
-              <w:sz w:val="15"/>
-              <w:szCs w:val="15"/>
-            </w:rPr>
-            <w:t>/</w:t>
-          </w:r>
-          <w:r>
-            <w:rPr>
-              <w:sz w:val="15"/>
-              <w:szCs w:val="15"/>
-            </w:rPr>
-            <w:t>Saale</w:t>
+            <w:t>Hof/Saale</w:t>
           </w:r>
         </w:p>
-        <w:p wp14:textId="77777777">
+        <w:p>
           <w:pPr>
             <w:pStyle w:val="TableContents"/>
             <w:jc w:val="center"/>
@@ -2191,13 +2063,12 @@
             <w:t>Steuer-Nr.: 223/147/40118</w:t>
           </w:r>
         </w:p>
-        <w:p wp14:textId="5828F3BB">
+        <w:p>
           <w:pPr>
             <w:pStyle w:val="Normal"/>
             <w:jc w:val="center"/>
             <w:rPr>
               <w:rFonts w:ascii="Open Sans" w:hAnsi="Open Sans" w:eastAsia="Open Sans" w:cs="Open Sans"/>
-              <w:noProof w:val="0"/>
               <w:sz w:val="15"/>
               <w:szCs w:val="15"/>
               <w:lang w:val="pl-PL"/>
@@ -2205,8 +2076,7 @@
           </w:pPr>
           <w:r>
             <w:rPr>
-              <w:rFonts w:ascii="Open Sans" w:hAnsi="Open Sans" w:eastAsia="Open Sans" w:cs="Open Sans"/>
-              <w:noProof w:val="0"/>
+              <w:rFonts w:eastAsia="Open Sans" w:cs="Open Sans"/>
               <w:sz w:val="15"/>
               <w:szCs w:val="15"/>
               <w:lang w:val="pl-PL"/>
@@ -2214,7 +2084,7 @@
             <w:t>Geschäftsführer: Attila Landgrafe</w:t>
           </w:r>
         </w:p>
-        <w:p wp14:textId="66576EA9">
+        <w:p>
           <w:pPr>
             <w:pStyle w:val="TableContents"/>
             <w:jc w:val="center"/>
@@ -2223,30 +2093,38 @@
               <w:szCs w:val="15"/>
             </w:rPr>
           </w:pPr>
+          <w:r>
+            <w:rPr>
+              <w:sz w:val="15"/>
+              <w:szCs w:val="15"/>
+            </w:rPr>
+          </w:r>
         </w:p>
       </w:tc>
     </w:tr>
   </w:tbl>
-  <w:p/>
-  <w:p xmlns:wp14="http://schemas.microsoft.com/office/word/2010/wordml" wp14:textId="5E08D37D">
+  <w:p>
+    <w:pPr>
+      <w:pStyle w:val="Normal"/>
+      <w:rPr/>
+    </w:pPr>
+    <w:r>
+      <w:rPr/>
+    </w:r>
+  </w:p>
+  <w:p>
     <w:pPr>
       <w:pStyle w:val="normal1"/>
-      <w:spacing w:before="240" w:after="240" w:line="14" w:lineRule="auto"/>
+      <w:spacing w:lineRule="auto" w:line="14" w:before="240" w:after="240"/>
       <w:jc w:val="right"/>
+      <w:rPr/>
     </w:pPr>
     <w:r>
       <w:rPr>
         <w:sz w:val="12"/>
         <w:szCs w:val="12"/>
       </w:rPr>
-      <w:t>Seite</w:t>
-    </w:r>
-    <w:r>
-      <w:rPr>
-        <w:sz w:val="12"/>
-        <w:szCs w:val="12"/>
-      </w:rPr>
-      <w:t xml:space="preserve"> </w:t>
+      <w:t xml:space="preserve">Seite </w:t>
     </w:r>
     <w:r>
       <w:rPr>
@@ -2256,10 +2134,25 @@
       <w:fldChar w:fldCharType="begin"/>
     </w:r>
     <w:r>
-      <w:instrText xml:space="preserve">PAGE</w:instrText>
+      <w:rPr>
+        <w:sz w:val="12"/>
+        <w:szCs w:val="12"/>
+      </w:rPr>
+      <w:instrText xml:space="preserve"> PAGE </w:instrText>
     </w:r>
     <w:r>
+      <w:rPr>
+        <w:sz w:val="12"/>
+        <w:szCs w:val="12"/>
+      </w:rPr>
       <w:fldChar w:fldCharType="separate"/>
+    </w:r>
+    <w:r>
+      <w:rPr>
+        <w:sz w:val="12"/>
+        <w:szCs w:val="12"/>
+      </w:rPr>
+      <w:t>2</w:t>
     </w:r>
     <w:r>
       <w:rPr>
@@ -2283,10 +2176,25 @@
       <w:fldChar w:fldCharType="begin"/>
     </w:r>
     <w:r>
-      <w:instrText xml:space="preserve">NUMPAGES</w:instrText>
+      <w:rPr>
+        <w:sz w:val="12"/>
+        <w:szCs w:val="12"/>
+      </w:rPr>
+      <w:instrText xml:space="preserve"> NUMPAGES </w:instrText>
     </w:r>
     <w:r>
+      <w:rPr>
+        <w:sz w:val="12"/>
+        <w:szCs w:val="12"/>
+      </w:rPr>
       <w:fldChar w:fldCharType="separate"/>
+    </w:r>
+    <w:r>
+      <w:rPr>
+        <w:sz w:val="12"/>
+        <w:szCs w:val="12"/>
+      </w:rPr>
+      <w:t>2</w:t>
     </w:r>
     <w:r>
       <w:rPr>
@@ -2303,10 +2211,10 @@
       <w:t xml:space="preserve"> </w:t>
     </w:r>
   </w:p>
-  <w:p xmlns:wp14="http://schemas.microsoft.com/office/word/2010/wordml" wp14:textId="77777777">
+  <w:p>
     <w:pPr>
       <w:pStyle w:val="normal1"/>
-      <w:spacing w:before="240" w:after="0" w:line="14" w:lineRule="auto"/>
+      <w:spacing w:lineRule="auto" w:line="14" w:before="240" w:after="0"/>
       <w:jc w:val="center"/>
       <w:rPr/>
     </w:pPr>
@@ -2331,194 +2239,26 @@
         <w:bottom w:w="55" w:type="dxa"/>
         <w:right w:w="55" w:type="dxa"/>
       </w:tblCellMar>
+      <w:tblLook w:val="0600" w:noVBand="1" w:noHBand="1" w:lastColumn="0" w:firstColumn="0" w:lastRow="0" w:firstRow="0"/>
     </w:tblPr>
     <w:tblGrid>
       <w:gridCol w:w="3118"/>
-      <w:gridCol w:w="3125"/>
-      <w:gridCol w:w="3111"/>
+      <w:gridCol w:w="3124"/>
+      <w:gridCol w:w="3112"/>
     </w:tblGrid>
-    <w:tr xmlns:wp14="http://schemas.microsoft.com/office/word/2010/wordml" wp14:textId="77777777">
-      <w:trPr/>
+    <w:tr>
+      <w:trPr>
+        <w:trHeight w:val="665" w:hRule="atLeast"/>
+      </w:trPr>
       <w:tc>
         <w:tcPr>
           <w:tcW w:w="3118" w:type="dxa"/>
-          <w:tcBorders/>
+          <w:tcBorders>
+            <w:top w:val="single" w:sz="18" w:space="0" w:color="2E74B5"/>
+          </w:tcBorders>
+          <w:vAlign w:val="center"/>
         </w:tcPr>
-        <w:p wp14:textId="77777777">
-          <w:pPr>
-            <w:pStyle w:val="TableContents"/>
-            <w:jc w:val="center"/>
-            <w:rPr>
-              <w:sz w:val="12"/>
-              <w:szCs w:val="12"/>
-            </w:rPr>
-          </w:pPr>
-          <w:r>
-            <w:rPr>
-              <w:sz w:val="12"/>
-              <w:szCs w:val="12"/>
-            </w:rPr>
-            <w:t xml:space="preserve">emc2 Atilla Landgrafe </w:t>
-          </w:r>
-        </w:p>
-      </w:tc>
-      <w:tc>
-        <w:tcPr>
-          <w:tcW w:w="3125" w:type="dxa"/>
-          <w:tcBorders/>
-        </w:tcPr>
-        <w:p wp14:textId="77777777">
-          <w:pPr>
-            <w:pStyle w:val="TableContents"/>
-            <w:jc w:val="center"/>
-            <w:rPr>
-              <w:sz w:val="12"/>
-              <w:szCs w:val="12"/>
-            </w:rPr>
-          </w:pPr>
-          <w:r>
-            <w:rPr>
-              <w:sz w:val="12"/>
-              <w:szCs w:val="12"/>
-            </w:rPr>
-            <w:t>Tel.: 09281 5915900</w:t>
-          </w:r>
-        </w:p>
-      </w:tc>
-      <w:tc>
-        <w:tcPr>
-          <w:tcW w:w="3111" w:type="dxa"/>
-          <w:tcBorders/>
-        </w:tcPr>
-        <w:p wp14:textId="77777777">
-          <w:pPr>
-            <w:pStyle w:val="TableContents"/>
-            <w:jc w:val="center"/>
-            <w:rPr>
-              <w:sz w:val="12"/>
-              <w:szCs w:val="12"/>
-            </w:rPr>
-          </w:pPr>
-          <w:r>
-            <w:rPr>
-              <w:sz w:val="12"/>
-              <w:szCs w:val="12"/>
-            </w:rPr>
-            <w:t>Hof/Saale</w:t>
-          </w:r>
-        </w:p>
-      </w:tc>
-    </w:tr>
-    <w:tr xmlns:wp14="http://schemas.microsoft.com/office/word/2010/wordml" wp14:textId="77777777">
-      <w:trPr/>
-      <w:tc>
-        <w:tcPr>
-          <w:tcW w:w="3118" w:type="dxa"/>
-          <w:tcBorders/>
-        </w:tcPr>
-        <w:p wp14:textId="77777777">
-          <w:pPr>
-            <w:pStyle w:val="TableContents"/>
-            <w:jc w:val="center"/>
-            <w:rPr>
-              <w:sz w:val="12"/>
-              <w:szCs w:val="12"/>
-            </w:rPr>
-          </w:pPr>
-          <w:r>
-            <w:rPr>
-              <w:sz w:val="12"/>
-              <w:szCs w:val="12"/>
-            </w:rPr>
-            <w:t>Waldstraße 5</w:t>
-          </w:r>
-        </w:p>
-      </w:tc>
-      <w:tc>
-        <w:tcPr>
-          <w:tcW w:w="3125" w:type="dxa"/>
-          <w:tcBorders/>
-        </w:tcPr>
-        <w:p wp14:textId="77777777">
-          <w:pPr>
-            <w:pStyle w:val="TableContents"/>
-            <w:jc w:val="center"/>
-            <w:rPr>
-              <w:sz w:val="12"/>
-              <w:szCs w:val="12"/>
-            </w:rPr>
-          </w:pPr>
-          <w:r>
-            <w:rPr>
-              <w:sz w:val="12"/>
-              <w:szCs w:val="12"/>
-            </w:rPr>
-            <w:t>Fax.: 09281 591590</w:t>
-          </w:r>
-          <w:r>
-            <w:rPr>
-              <w:sz w:val="12"/>
-              <w:szCs w:val="12"/>
-            </w:rPr>
-            <w:t>9</w:t>
-          </w:r>
-        </w:p>
-      </w:tc>
-      <w:tc>
-        <w:tcPr>
-          <w:tcW w:w="3111" w:type="dxa"/>
-          <w:tcBorders/>
-        </w:tcPr>
-        <w:p wp14:textId="77777777">
-          <w:pPr>
-            <w:pStyle w:val="TableContents"/>
-            <w:jc w:val="center"/>
-            <w:rPr>
-              <w:sz w:val="12"/>
-              <w:szCs w:val="12"/>
-            </w:rPr>
-          </w:pPr>
-          <w:r>
-            <w:rPr>
-              <w:sz w:val="12"/>
-              <w:szCs w:val="12"/>
-            </w:rPr>
-            <w:t>Steuer-Nr.: 223/147/40118</w:t>
-          </w:r>
-        </w:p>
-      </w:tc>
-    </w:tr>
-    <w:tr xmlns:wp14="http://schemas.microsoft.com/office/word/2010/wordml" wp14:textId="77777777">
-      <w:trPr/>
-      <w:tc>
-        <w:tcPr>
-          <w:tcW w:w="3118" w:type="dxa"/>
-          <w:tcBorders/>
-        </w:tcPr>
-        <w:p wp14:textId="77777777">
-          <w:pPr>
-            <w:pStyle w:val="TableContents"/>
-            <w:jc w:val="center"/>
-            <w:rPr>
-              <w:sz w:val="12"/>
-              <w:szCs w:val="12"/>
-            </w:rPr>
-          </w:pPr>
-          <w:r>
-            <w:rPr>
-              <w:sz w:val="12"/>
-              <w:szCs w:val="12"/>
-            </w:rPr>
-            <w:t>95032 Hof</w:t>
-          </w:r>
-        </w:p>
-      </w:tc>
-      <w:tc>
-        <w:tcPr>
-          <w:tcW w:w="3125" w:type="dxa"/>
-          <w:tcBorders/>
-        </w:tcPr>
-        <w:p wp14:textId="77777777">
+        <w:p>
           <w:pPr>
             <w:pStyle w:val="TableContents"/>
             <w:jc w:val="center"/>
@@ -2526,67 +2266,59 @@
           </w:pPr>
           <w:r>
             <w:rPr>
-              <w:sz w:val="12"/>
-              <w:szCs w:val="12"/>
-            </w:rPr>
-            <w:t xml:space="preserve">Email: </w:t>
-          </w:r>
-          <w:hyperlink r:id="rId1">
-            <w:r>
-              <w:rPr>
-                <w:rStyle w:val="Hyperlink"/>
-                <w:sz w:val="12"/>
-                <w:szCs w:val="12"/>
-              </w:rPr>
-              <w:t>kontakt@e-m-c-2.de</w:t>
-            </w:r>
-          </w:hyperlink>
-        </w:p>
-      </w:tc>
-      <w:tc>
-        <w:tcPr>
-          <w:tcW w:w="3111" w:type="dxa"/>
-          <w:tcBorders/>
-        </w:tcPr>
-        <w:p wp14:textId="77777777">
-          <w:pPr>
-            <w:pStyle w:val="Normal"/>
-            <w:jc w:val="center"/>
-            <w:rPr>
-              <w:sz w:val="12"/>
-              <w:szCs w:val="12"/>
-            </w:rPr>
-          </w:pPr>
-          <w:r>
-            <w:rPr>
-              <w:sz w:val="12"/>
-              <w:szCs w:val="12"/>
-            </w:rPr>
-            <w:t>Geschäftsführer: Attila Landgrafe</w:t>
+              <w:sz w:val="15"/>
+              <w:szCs w:val="15"/>
+            </w:rPr>
+            <w:t>emc2 Atilla Landgrafe</w:t>
           </w:r>
         </w:p>
-      </w:tc>
-    </w:tr>
-    <w:tr xmlns:wp14="http://schemas.microsoft.com/office/word/2010/wordml" wp14:textId="77777777">
-      <w:trPr/>
-      <w:tc>
-        <w:tcPr>
-          <w:tcW w:w="3118" w:type="dxa"/>
-          <w:tcBorders/>
-        </w:tcPr>
-        <w:p wp14:textId="77777777">
+        <w:p>
           <w:pPr>
             <w:pStyle w:val="TableContents"/>
             <w:jc w:val="center"/>
             <w:rPr>
-              <w:sz w:val="12"/>
-              <w:szCs w:val="12"/>
+              <w:sz w:val="15"/>
+              <w:szCs w:val="15"/>
             </w:rPr>
           </w:pPr>
           <w:r>
             <w:rPr>
-              <w:sz w:val="12"/>
-              <w:szCs w:val="12"/>
+              <w:sz w:val="15"/>
+              <w:szCs w:val="15"/>
+            </w:rPr>
+            <w:t>Waldstraße 5</w:t>
+          </w:r>
+        </w:p>
+        <w:p>
+          <w:pPr>
+            <w:pStyle w:val="TableContents"/>
+            <w:jc w:val="center"/>
+            <w:rPr>
+              <w:sz w:val="15"/>
+              <w:szCs w:val="15"/>
+            </w:rPr>
+          </w:pPr>
+          <w:r>
+            <w:rPr>
+              <w:sz w:val="15"/>
+              <w:szCs w:val="15"/>
+            </w:rPr>
+            <w:t>95032 Hof</w:t>
+          </w:r>
+        </w:p>
+        <w:p>
+          <w:pPr>
+            <w:pStyle w:val="TableContents"/>
+            <w:jc w:val="center"/>
+            <w:rPr>
+              <w:sz w:val="15"/>
+              <w:szCs w:val="15"/>
+            </w:rPr>
+          </w:pPr>
+          <w:r>
+            <w:rPr>
+              <w:sz w:val="15"/>
+              <w:szCs w:val="15"/>
             </w:rPr>
             <w:t>Deutschland</w:t>
           </w:r>
@@ -2594,22 +2326,72 @@
       </w:tc>
       <w:tc>
         <w:tcPr>
-          <w:tcW w:w="3125" w:type="dxa"/>
-          <w:tcBorders/>
+          <w:tcW w:w="3124" w:type="dxa"/>
+          <w:tcBorders>
+            <w:top w:val="single" w:sz="18" w:space="0" w:color="2E74B5"/>
+          </w:tcBorders>
         </w:tcPr>
-        <w:p wp14:textId="77777777">
+        <w:p>
           <w:pPr>
             <w:pStyle w:val="TableContents"/>
             <w:jc w:val="center"/>
-            <w:rPr>
-              <w:sz w:val="12"/>
-              <w:szCs w:val="12"/>
-            </w:rPr>
+            <w:rPr/>
           </w:pPr>
           <w:r>
             <w:rPr>
-              <w:sz w:val="12"/>
-              <w:szCs w:val="12"/>
+              <w:sz w:val="15"/>
+              <w:szCs w:val="15"/>
+            </w:rPr>
+            <w:t>Tel.: 09281 5915900</w:t>
+          </w:r>
+        </w:p>
+        <w:p>
+          <w:pPr>
+            <w:pStyle w:val="TableContents"/>
+            <w:jc w:val="center"/>
+            <w:rPr>
+              <w:sz w:val="15"/>
+              <w:szCs w:val="15"/>
+            </w:rPr>
+          </w:pPr>
+          <w:r>
+            <w:rPr>
+              <w:sz w:val="15"/>
+              <w:szCs w:val="15"/>
+            </w:rPr>
+            <w:t>Fax.: 09281 5915909</w:t>
+          </w:r>
+        </w:p>
+        <w:p>
+          <w:pPr>
+            <w:pStyle w:val="TableContents"/>
+            <w:jc w:val="center"/>
+            <w:rPr>
+              <w:sz w:val="15"/>
+              <w:szCs w:val="15"/>
+            </w:rPr>
+          </w:pPr>
+          <w:r>
+            <w:rPr>
+              <w:sz w:val="15"/>
+              <w:szCs w:val="15"/>
+            </w:rPr>
+            <w:t>Email: kontakt@e-m-c-2.de</w:t>
+          </w:r>
+        </w:p>
+        <w:p>
+          <w:pPr>
+            <w:pStyle w:val="TableContents"/>
+            <w:jc w:val="center"/>
+            <w:rPr>
+              <w:sz w:val="15"/>
+              <w:szCs w:val="15"/>
+            </w:rPr>
+          </w:pPr>
+          <w:r>
+            <w:rPr>
+              <w:sz w:val="15"/>
+              <w:szCs w:val="15"/>
             </w:rPr>
             <w:t>Web: emczwei.de</w:t>
           </w:r>
@@ -2617,250 +2399,194 @@
       </w:tc>
       <w:tc>
         <w:tcPr>
-          <w:tcW w:w="3111" w:type="dxa"/>
-          <w:tcBorders/>
+          <w:tcW w:w="3112" w:type="dxa"/>
+          <w:tcBorders>
+            <w:top w:val="single" w:sz="18" w:space="0" w:color="2E74B5"/>
+          </w:tcBorders>
         </w:tcPr>
-        <w:p wp14:textId="77777777">
+        <w:p>
           <w:pPr>
             <w:pStyle w:val="TableContents"/>
             <w:jc w:val="center"/>
-            <w:rPr>
-              <w:sz w:val="12"/>
-              <w:szCs w:val="12"/>
-            </w:rPr>
+            <w:rPr/>
           </w:pPr>
           <w:r>
             <w:rPr>
-              <w:sz w:val="12"/>
-              <w:szCs w:val="12"/>
+              <w:sz w:val="15"/>
+              <w:szCs w:val="15"/>
+            </w:rPr>
+            <w:t>Hof/Saale</w:t>
+          </w:r>
+        </w:p>
+        <w:p>
+          <w:pPr>
+            <w:pStyle w:val="TableContents"/>
+            <w:jc w:val="center"/>
+            <w:rPr>
+              <w:sz w:val="15"/>
+              <w:szCs w:val="15"/>
+            </w:rPr>
+          </w:pPr>
+          <w:r>
+            <w:rPr>
+              <w:sz w:val="15"/>
+              <w:szCs w:val="15"/>
+            </w:rPr>
+            <w:t>Steuer-Nr.: 223/147/40118</w:t>
+          </w:r>
+        </w:p>
+        <w:p>
+          <w:pPr>
+            <w:pStyle w:val="Normal"/>
+            <w:jc w:val="center"/>
+            <w:rPr>
+              <w:rFonts w:ascii="Open Sans" w:hAnsi="Open Sans" w:eastAsia="Open Sans" w:cs="Open Sans"/>
+              <w:sz w:val="15"/>
+              <w:szCs w:val="15"/>
+              <w:lang w:val="pl-PL"/>
+            </w:rPr>
+          </w:pPr>
+          <w:r>
+            <w:rPr>
+              <w:rFonts w:eastAsia="Open Sans" w:cs="Open Sans"/>
+              <w:sz w:val="15"/>
+              <w:szCs w:val="15"/>
+              <w:lang w:val="pl-PL"/>
+            </w:rPr>
+            <w:t>Geschäftsführer: Attila Landgrafe</w:t>
+          </w:r>
+        </w:p>
+        <w:p>
+          <w:pPr>
+            <w:pStyle w:val="TableContents"/>
+            <w:jc w:val="center"/>
+            <w:rPr>
+              <w:sz w:val="15"/>
+              <w:szCs w:val="15"/>
+            </w:rPr>
+          </w:pPr>
+          <w:r>
+            <w:rPr>
+              <w:sz w:val="15"/>
+              <w:szCs w:val="15"/>
             </w:rPr>
           </w:r>
         </w:p>
       </w:tc>
     </w:tr>
   </w:tbl>
-  <w:p xmlns:wp14="http://schemas.microsoft.com/office/word/2010/wordml" wp14:textId="77777777">
+  <w:p>
     <w:pPr>
-      <w:pStyle w:val="normal1"/>
-      <w:spacing w:before="240" w:after="240" w:line="14" w:lineRule="auto"/>
+      <w:pStyle w:val="Normal"/>
       <w:rPr/>
     </w:pPr>
     <w:r>
       <w:rPr/>
     </w:r>
   </w:p>
-  <w:tbl>
-    <w:tblPr>
-      <w:tblStyle w:val="NormalTable0"/>
-      <w:tblW w:w="9885" w:type="dxa"/>
-      <w:jc w:val="left"/>
-      <w:tblInd w:w="0" w:type="dxa"/>
-      <w:tblLayout w:type="fixed"/>
-      <w:tblCellMar>
-        <w:top w:w="0" w:type="dxa"/>
-        <w:left w:w="10" w:type="dxa"/>
-        <w:bottom w:w="0" w:type="dxa"/>
-        <w:right w:w="10" w:type="dxa"/>
-      </w:tblCellMar>
-      <w:tblLook w:val="04a0" w:firstRow="1" w:lastRow="0" w:firstColumn="1" w:lastColumn="0" w:noHBand="0" w:noVBand="1"/>
-    </w:tblPr>
-    <w:tblGrid>
-      <w:gridCol w:w="8057"/>
-      <w:gridCol w:w="1827"/>
-    </w:tblGrid>
-    <w:tr xmlns:wp14="http://schemas.microsoft.com/office/word/2010/wordml" wp14:textId="77777777">
-      <w:trPr>
-        <w:trHeight w:val="20" w:hRule="atLeast"/>
-      </w:trPr>
-      <w:tc>
-        <w:tcPr>
-          <w:tcW w:w="8057" w:type="dxa"/>
-          <w:tcBorders>
-            <w:top w:val="single" w:color="FFFFFF" w:sz="8" w:space="0"/>
-            <w:left w:val="single" w:color="FFFFFF" w:sz="8" w:space="0"/>
-            <w:bottom w:val="single" w:color="FFFFFF" w:sz="8" w:space="0"/>
-            <w:right w:val="single" w:color="FFFFFF" w:sz="8" w:space="0"/>
-          </w:tcBorders>
-          <w:vAlign w:val="bottom"/>
-        </w:tcPr>
-        <w:p wp14:textId="77777777">
-          <w:pPr>
-            <w:pStyle w:val="Normal"/>
-            <w:keepLines/>
-            <w:suppressAutoHyphens w:val="true"/>
-            <w:spacing w:before="0" w:after="0"/>
-            <w:ind w:left="720"/>
-            <w:jc w:val="center"/>
-            <w:rPr>
-              <w:sz w:val="14"/>
-              <w:szCs w:val="14"/>
-              <w:lang w:val="de-DE"/>
-            </w:rPr>
-          </w:pPr>
-          <w:r>
-            <w:rPr/>
-          </w:r>
-        </w:p>
-      </w:tc>
-      <w:tc>
-        <w:tcPr>
-          <w:tcW w:w="1827" w:type="dxa"/>
-          <w:tcBorders>
-            <w:top w:val="single" w:color="FFFFFF" w:sz="8" w:space="0"/>
-            <w:left w:val="single" w:color="FFFFFF" w:sz="8" w:space="0"/>
-            <w:bottom w:val="single" w:color="FFFFFF" w:sz="8" w:space="0"/>
-            <w:right w:val="single" w:color="FFFFFF" w:sz="8" w:space="0"/>
-          </w:tcBorders>
-        </w:tcPr>
-        <w:p wp14:textId="77777777">
-          <w:pPr>
-            <w:pStyle w:val="normal1"/>
-            <w:suppressAutoHyphens w:val="true"/>
-            <w:spacing w:before="0" w:after="0"/>
-            <w:jc w:val="right"/>
-            <w:rPr>
-              <w:sz w:val="16"/>
-              <w:szCs w:val="16"/>
-            </w:rPr>
-          </w:pPr>
-          <w:r>
-            <w:rPr>
-              <w:rFonts w:eastAsia="Open Sans" w:cs="Open Sans"/>
-              <w:kern w:val="0"/>
-              <w:sz w:val="16"/>
-              <w:szCs w:val="16"/>
-              <w:lang w:val="de-DE" w:eastAsia="en-US" w:bidi="ar-SA"/>
-            </w:rPr>
-            <w:br/>
-          </w:r>
-          <w:r>
-            <w:rPr>
-              <w:rFonts w:ascii="Apple SD Gothic Neo" w:hAnsi="Apple SD Gothic Neo" w:eastAsia="Open Sans" w:cs="Open Sans"/>
-              <w:kern w:val="0"/>
-              <w:sz w:val="12"/>
-              <w:szCs w:val="12"/>
-              <w:lang w:val="pl-PL" w:eastAsia="en-US" w:bidi="ar-SA"/>
-            </w:rPr>
-            <w:t xml:space="preserve">Seite </w:t>
-          </w:r>
-          <w:r>
-            <w:rPr>
-              <w:rFonts w:ascii="Apple SD Gothic Neo" w:hAnsi="Apple SD Gothic Neo" w:eastAsia="Open Sans" w:cs="Open Sans"/>
-              <w:kern w:val="0"/>
-              <w:sz w:val="12"/>
-              <w:szCs w:val="12"/>
-              <w:lang w:val="pl-PL" w:eastAsia="en-US" w:bidi="ar-SA"/>
-            </w:rPr>
-            <w:fldChar w:fldCharType="begin"/>
-          </w:r>
-          <w:r>
-            <w:rPr>
-              <w:sz w:val="12"/>
-              <w:kern w:val="0"/>
-              <w:szCs w:val="12"/>
-              <w:rFonts w:ascii="Apple SD Gothic Neo" w:hAnsi="Apple SD Gothic Neo" w:eastAsia="Open Sans" w:cs="Open Sans"/>
-              <w:lang w:val="pl-PL" w:eastAsia="en-US" w:bidi="ar-SA"/>
-            </w:rPr>
-            <w:instrText xml:space="preserve"> PAGE </w:instrText>
-          </w:r>
-          <w:r>
-            <w:rPr>
-              <w:sz w:val="12"/>
-              <w:kern w:val="0"/>
-              <w:szCs w:val="12"/>
-              <w:rFonts w:ascii="Apple SD Gothic Neo" w:hAnsi="Apple SD Gothic Neo" w:eastAsia="Open Sans" w:cs="Open Sans"/>
-              <w:lang w:val="pl-PL" w:eastAsia="en-US" w:bidi="ar-SA"/>
-            </w:rPr>
-            <w:fldChar w:fldCharType="separate"/>
-          </w:r>
-          <w:r>
-            <w:rPr>
-              <w:sz w:val="12"/>
-              <w:kern w:val="0"/>
-              <w:szCs w:val="12"/>
-              <w:rFonts w:ascii="Apple SD Gothic Neo" w:hAnsi="Apple SD Gothic Neo" w:eastAsia="Open Sans" w:cs="Open Sans"/>
-              <w:lang w:val="pl-PL" w:eastAsia="en-US" w:bidi="ar-SA"/>
-            </w:rPr>
-            <w:t>2</w:t>
-          </w:r>
-          <w:r>
-            <w:rPr>
-              <w:sz w:val="12"/>
-              <w:kern w:val="0"/>
-              <w:szCs w:val="12"/>
-              <w:rFonts w:ascii="Apple SD Gothic Neo" w:hAnsi="Apple SD Gothic Neo" w:eastAsia="Open Sans" w:cs="Open Sans"/>
-              <w:lang w:val="pl-PL" w:eastAsia="en-US" w:bidi="ar-SA"/>
-            </w:rPr>
-            <w:fldChar w:fldCharType="end"/>
-          </w:r>
-          <w:r>
-            <w:rPr>
-              <w:rFonts w:ascii="Apple SD Gothic Neo" w:hAnsi="Apple SD Gothic Neo" w:eastAsia="Open Sans" w:cs="Open Sans"/>
-              <w:kern w:val="0"/>
-              <w:sz w:val="12"/>
-              <w:szCs w:val="12"/>
-              <w:lang w:val="pl-PL" w:eastAsia="en-US" w:bidi="ar-SA"/>
-            </w:rPr>
-            <w:t>/</w:t>
-          </w:r>
-          <w:r>
-            <w:rPr>
-              <w:rFonts w:ascii="Apple SD Gothic Neo" w:hAnsi="Apple SD Gothic Neo" w:eastAsia="Open Sans" w:cs="Open Sans"/>
-              <w:kern w:val="0"/>
-              <w:sz w:val="12"/>
-              <w:szCs w:val="12"/>
-              <w:lang w:val="pl-PL" w:eastAsia="en-US" w:bidi="ar-SA"/>
-            </w:rPr>
-            <w:fldChar w:fldCharType="begin"/>
-          </w:r>
-          <w:r>
-            <w:rPr>
-              <w:sz w:val="12"/>
-              <w:kern w:val="0"/>
-              <w:szCs w:val="12"/>
-              <w:rFonts w:ascii="Apple SD Gothic Neo" w:hAnsi="Apple SD Gothic Neo" w:eastAsia="Open Sans" w:cs="Open Sans"/>
-              <w:lang w:val="pl-PL" w:eastAsia="en-US" w:bidi="ar-SA"/>
-            </w:rPr>
-            <w:instrText xml:space="preserve"> NUMPAGES </w:instrText>
-          </w:r>
-          <w:r>
-            <w:rPr>
-              <w:sz w:val="12"/>
-              <w:kern w:val="0"/>
-              <w:szCs w:val="12"/>
-              <w:rFonts w:ascii="Apple SD Gothic Neo" w:hAnsi="Apple SD Gothic Neo" w:eastAsia="Open Sans" w:cs="Open Sans"/>
-              <w:lang w:val="pl-PL" w:eastAsia="en-US" w:bidi="ar-SA"/>
-            </w:rPr>
-            <w:fldChar w:fldCharType="separate"/>
-          </w:r>
-          <w:r>
-            <w:rPr>
-              <w:sz w:val="12"/>
-              <w:kern w:val="0"/>
-              <w:szCs w:val="12"/>
-              <w:rFonts w:ascii="Apple SD Gothic Neo" w:hAnsi="Apple SD Gothic Neo" w:eastAsia="Open Sans" w:cs="Open Sans"/>
-              <w:lang w:val="pl-PL" w:eastAsia="en-US" w:bidi="ar-SA"/>
-            </w:rPr>
-            <w:t>2</w:t>
-          </w:r>
-          <w:r>
-            <w:rPr>
-              <w:sz w:val="12"/>
-              <w:kern w:val="0"/>
-              <w:szCs w:val="12"/>
-              <w:rFonts w:ascii="Apple SD Gothic Neo" w:hAnsi="Apple SD Gothic Neo" w:eastAsia="Open Sans" w:cs="Open Sans"/>
-              <w:lang w:val="pl-PL" w:eastAsia="en-US" w:bidi="ar-SA"/>
-            </w:rPr>
-            <w:fldChar w:fldCharType="end"/>
-          </w:r>
-        </w:p>
-      </w:tc>
-    </w:tr>
-  </w:tbl>
-  <w:p xmlns:wp14="http://schemas.microsoft.com/office/word/2010/wordml" wp14:textId="77777777">
+  <w:p>
     <w:pPr>
       <w:pStyle w:val="normal1"/>
-      <w:spacing w:before="240" w:after="0" w:line="14" w:lineRule="auto"/>
+      <w:spacing w:lineRule="auto" w:line="14" w:before="240" w:after="240"/>
+      <w:jc w:val="right"/>
+      <w:rPr/>
+    </w:pPr>
+    <w:r>
+      <w:rPr>
+        <w:sz w:val="12"/>
+        <w:szCs w:val="12"/>
+      </w:rPr>
+      <w:t xml:space="preserve">Seite </w:t>
+    </w:r>
+    <w:r>
+      <w:rPr>
+        <w:sz w:val="12"/>
+        <w:szCs w:val="12"/>
+      </w:rPr>
+      <w:fldChar w:fldCharType="begin"/>
+    </w:r>
+    <w:r>
+      <w:rPr>
+        <w:sz w:val="12"/>
+        <w:szCs w:val="12"/>
+      </w:rPr>
+      <w:instrText xml:space="preserve"> PAGE </w:instrText>
+    </w:r>
+    <w:r>
+      <w:rPr>
+        <w:sz w:val="12"/>
+        <w:szCs w:val="12"/>
+      </w:rPr>
+      <w:fldChar w:fldCharType="separate"/>
+    </w:r>
+    <w:r>
+      <w:rPr>
+        <w:sz w:val="12"/>
+        <w:szCs w:val="12"/>
+      </w:rPr>
+      <w:t>2</w:t>
+    </w:r>
+    <w:r>
+      <w:rPr>
+        <w:sz w:val="12"/>
+        <w:szCs w:val="12"/>
+      </w:rPr>
+      <w:fldChar w:fldCharType="end"/>
+    </w:r>
+    <w:r>
+      <w:rPr>
+        <w:sz w:val="12"/>
+        <w:szCs w:val="12"/>
+      </w:rPr>
+      <w:t xml:space="preserve"> / </w:t>
+    </w:r>
+    <w:r>
+      <w:rPr>
+        <w:sz w:val="12"/>
+        <w:szCs w:val="12"/>
+      </w:rPr>
+      <w:fldChar w:fldCharType="begin"/>
+    </w:r>
+    <w:r>
+      <w:rPr>
+        <w:sz w:val="12"/>
+        <w:szCs w:val="12"/>
+      </w:rPr>
+      <w:instrText xml:space="preserve"> NUMPAGES </w:instrText>
+    </w:r>
+    <w:r>
+      <w:rPr>
+        <w:sz w:val="12"/>
+        <w:szCs w:val="12"/>
+      </w:rPr>
+      <w:fldChar w:fldCharType="separate"/>
+    </w:r>
+    <w:r>
+      <w:rPr>
+        <w:sz w:val="12"/>
+        <w:szCs w:val="12"/>
+      </w:rPr>
+      <w:t>2</w:t>
+    </w:r>
+    <w:r>
+      <w:rPr>
+        <w:sz w:val="12"/>
+        <w:szCs w:val="12"/>
+      </w:rPr>
+      <w:fldChar w:fldCharType="end"/>
+    </w:r>
+    <w:r>
+      <w:rPr>
+        <w:sz w:val="12"/>
+        <w:szCs w:val="12"/>
+      </w:rPr>
+      <w:t xml:space="preserve"> </w:t>
+    </w:r>
+  </w:p>
+  <w:p>
+    <w:pPr>
+      <w:pStyle w:val="normal1"/>
+      <w:spacing w:lineRule="auto" w:line="14" w:before="240" w:after="0"/>
       <w:jc w:val="center"/>
       <w:rPr/>
     </w:pPr>
@@ -2873,7 +2599,7 @@
 
 <file path=word/header1.xml><?xml version="1.0" encoding="utf-8"?>
 <w:hdr xmlns:o="urn:schemas-microsoft-com:office:office" xmlns:r="http://schemas.openxmlformats.org/officeDocument/2006/relationships" xmlns:v="urn:schemas-microsoft-com:vml" xmlns:w="http://schemas.openxmlformats.org/wordprocessingml/2006/main" xmlns:w10="urn:schemas-microsoft-com:office:word" xmlns:wp="http://schemas.openxmlformats.org/drawingml/2006/wordprocessingDrawing" xmlns:pic="http://schemas.openxmlformats.org/drawingml/2006/picture" xmlns:wps="http://schemas.microsoft.com/office/word/2010/wordprocessingShape" xmlns:wpg="http://schemas.microsoft.com/office/word/2010/wordprocessingGroup" xmlns:mc="http://schemas.openxmlformats.org/markup-compatibility/2006" xmlns:wp14="http://schemas.microsoft.com/office/word/2010/wordprocessingDrawing" xmlns:w14="http://schemas.microsoft.com/office/word/2010/wordml" xmlns:w15="http://schemas.microsoft.com/office/word/2012/wordml" mc:Ignorable="w14 wp14 w15">
-  <w:p xmlns:wp14="http://schemas.microsoft.com/office/word/2010/wordml" wp14:textId="77777777">
+  <w:p>
     <w:pPr>
       <w:pStyle w:val="Header"/>
       <w:rPr/>
@@ -2886,8 +2612,8 @@
 </file>
 
 <file path=word/header2.xml><?xml version="1.0" encoding="utf-8"?>
-<w:hdr xmlns:o="urn:schemas-microsoft-com:office:office" xmlns:r="http://schemas.openxmlformats.org/officeDocument/2006/relationships" xmlns:v="urn:schemas-microsoft-com:vml" xmlns:w="http://schemas.openxmlformats.org/wordprocessingml/2006/main" xmlns:w10="urn:schemas-microsoft-com:office:word" xmlns:wp="http://schemas.openxmlformats.org/drawingml/2006/wordprocessingDrawing" xmlns:pic="http://schemas.openxmlformats.org/drawingml/2006/picture" xmlns:wps="http://schemas.microsoft.com/office/word/2010/wordprocessingShape" xmlns:wpg="http://schemas.microsoft.com/office/word/2010/wordprocessingGroup" xmlns:mc="http://schemas.openxmlformats.org/markup-compatibility/2006" xmlns:wp14="http://schemas.microsoft.com/office/word/2010/wordprocessingDrawing" xmlns:w14="http://schemas.microsoft.com/office/word/2010/wordml" xmlns:w15="http://schemas.microsoft.com/office/word/2012/wordml" xmlns:a="http://schemas.openxmlformats.org/drawingml/2006/main" mc:Ignorable="w14 wp14 w15">
-  <w:p xmlns:wp14="http://schemas.microsoft.com/office/word/2010/wordml" wp14:textId="77777777">
+<w:hdr xmlns:o="urn:schemas-microsoft-com:office:office" xmlns:r="http://schemas.openxmlformats.org/officeDocument/2006/relationships" xmlns:v="urn:schemas-microsoft-com:vml" xmlns:w="http://schemas.openxmlformats.org/wordprocessingml/2006/main" xmlns:w10="urn:schemas-microsoft-com:office:word" xmlns:wp="http://schemas.openxmlformats.org/drawingml/2006/wordprocessingDrawing" xmlns:pic="http://schemas.openxmlformats.org/drawingml/2006/picture" xmlns:wps="http://schemas.microsoft.com/office/word/2010/wordprocessingShape" xmlns:wpg="http://schemas.microsoft.com/office/word/2010/wordprocessingGroup" xmlns:mc="http://schemas.openxmlformats.org/markup-compatibility/2006" xmlns:wp14="http://schemas.microsoft.com/office/word/2010/wordprocessingDrawing" xmlns:w14="http://schemas.microsoft.com/office/word/2010/wordml" xmlns:w15="http://schemas.microsoft.com/office/word/2012/wordml" mc:Ignorable="w14 wp14 w15">
+  <w:p>
     <w:pPr>
       <w:pStyle w:val="normal1"/>
       <w:rPr/>
@@ -2895,7 +2621,7 @@
     <w:r>
       <w:rPr/>
       <w:drawing>
-        <wp:anchor xmlns:wp14="http://schemas.microsoft.com/office/word/2010/wordprocessingDrawing" distT="0" distB="0" distL="0" distR="0" simplePos="0" relativeHeight="2" behindDoc="1" locked="0" layoutInCell="0" allowOverlap="1" wp14:anchorId="341511EE" wp14:editId="7777777">
+        <wp:anchor behindDoc="1" distT="0" distB="0" distL="0" distR="0" simplePos="0" locked="0" layoutInCell="0" allowOverlap="1" relativeHeight="5">
           <wp:simplePos x="0" y="0"/>
           <wp:positionH relativeFrom="margin">
             <wp:align>right</wp:align>
@@ -2942,11 +2668,11 @@
       </w:drawing>
     </w:r>
   </w:p>
-  <w:p xmlns:wp14="http://schemas.microsoft.com/office/word/2010/wordml" wp14:textId="77777777">
+  <w:p>
     <w:pPr>
       <w:pStyle w:val="Normal"/>
       <w:spacing w:before="0" w:after="0"/>
-      <w:ind w:left="0" w:hanging="0"/>
+      <w:ind w:hanging="0" w:left="0"/>
       <w:jc w:val="left"/>
       <w:rPr>
         <w:spacing w:val="58"/>
@@ -2965,7 +2691,7 @@
       <w:t>EmC2  Alltagshilfe</w:t>
     </w:r>
   </w:p>
-  <w:p xmlns:wp14="http://schemas.microsoft.com/office/word/2010/wordml" wp14:textId="77777777">
+  <w:p>
     <w:pPr>
       <w:pStyle w:val="Normal"/>
       <w:spacing w:before="0" w:after="300"/>
@@ -2976,7 +2702,7 @@
       <mc:AlternateContent>
         <mc:Choice Requires="wps">
           <w:drawing>
-            <wp:inline xmlns:wp14="http://schemas.microsoft.com/office/word/2010/wordprocessingDrawing" distT="0" distB="0" distL="0" distR="0" wp14:anchorId="74C32908" wp14:editId="7777777">
+            <wp:inline distT="0" distB="0" distL="0" distR="0" wp14:anchorId="74C32908">
               <wp:extent cx="4807585" cy="28575"/>
               <wp:effectExtent l="0" t="0" r="0" b="0"/>
               <wp:docPr id="2" name="blue-line"/>
@@ -3013,9 +2739,9 @@
           </w:drawing>
         </mc:Choice>
         <mc:Fallback>
-          <w:pict w14:anchorId="6E5B893D">
-            <v:rect id="shape_0" style="position:absolute;margin-left:0pt;margin-top:-2.3pt;width:378.5pt;height:2.2pt;mso-wrap-style:none;v-text-anchor:middle;mso-position-vertical:top" o:allowincell="f" fillcolor="#2e74b5" stroked="f" ID="blue-line" path="m0,0l-2147483645,0l-2147483645,-2147483646l0,-2147483646xe">
-              <v:fill type="solid" color2="#d18b4a" o:detectmouseclick="t"/>
+          <w:pict>
+            <v:rect id="shape_0" ID="blue-line" path="m0,0l-2147483645,0l-2147483645,-2147483646l0,-2147483646xe" fillcolor="#2e74b5" stroked="f" o:allowincell="f" style="position:absolute;margin-left:0pt;margin-top:-2.3pt;width:378.5pt;height:2.2pt;mso-wrap-style:none;v-text-anchor:middle;mso-position-vertical:top" wp14:anchorId="74C32908">
+              <v:fill o:detectmouseclick="t" type="solid" color2="#d18b4a"/>
               <v:stroke color="#3465a4" joinstyle="round" endcap="flat"/>
               <w10:wrap type="square"/>
             </v:rect>
@@ -3028,8 +2754,8 @@
 </file>
 
 <file path=word/header3.xml><?xml version="1.0" encoding="utf-8"?>
-<w:hdr xmlns:o="urn:schemas-microsoft-com:office:office" xmlns:r="http://schemas.openxmlformats.org/officeDocument/2006/relationships" xmlns:v="urn:schemas-microsoft-com:vml" xmlns:w="http://schemas.openxmlformats.org/wordprocessingml/2006/main" xmlns:w10="urn:schemas-microsoft-com:office:word" xmlns:wp="http://schemas.openxmlformats.org/drawingml/2006/wordprocessingDrawing" xmlns:pic="http://schemas.openxmlformats.org/drawingml/2006/picture" xmlns:wps="http://schemas.microsoft.com/office/word/2010/wordprocessingShape" xmlns:wpg="http://schemas.microsoft.com/office/word/2010/wordprocessingGroup" xmlns:mc="http://schemas.openxmlformats.org/markup-compatibility/2006" xmlns:wp14="http://schemas.microsoft.com/office/word/2010/wordprocessingDrawing" xmlns:w14="http://schemas.microsoft.com/office/word/2010/wordml" xmlns:w15="http://schemas.microsoft.com/office/word/2012/wordml" xmlns:a="http://schemas.openxmlformats.org/drawingml/2006/main" mc:Ignorable="w14 wp14 w15">
-  <w:p xmlns:wp14="http://schemas.microsoft.com/office/word/2010/wordml" wp14:textId="77777777">
+<w:hdr xmlns:o="urn:schemas-microsoft-com:office:office" xmlns:r="http://schemas.openxmlformats.org/officeDocument/2006/relationships" xmlns:v="urn:schemas-microsoft-com:vml" xmlns:w="http://schemas.openxmlformats.org/wordprocessingml/2006/main" xmlns:w10="urn:schemas-microsoft-com:office:word" xmlns:wp="http://schemas.openxmlformats.org/drawingml/2006/wordprocessingDrawing" xmlns:pic="http://schemas.openxmlformats.org/drawingml/2006/picture" xmlns:wps="http://schemas.microsoft.com/office/word/2010/wordprocessingShape" xmlns:wpg="http://schemas.microsoft.com/office/word/2010/wordprocessingGroup" xmlns:mc="http://schemas.openxmlformats.org/markup-compatibility/2006" xmlns:wp14="http://schemas.microsoft.com/office/word/2010/wordprocessingDrawing" xmlns:w14="http://schemas.microsoft.com/office/word/2010/wordml" xmlns:w15="http://schemas.microsoft.com/office/word/2012/wordml" mc:Ignorable="w14 wp14 w15">
+  <w:p>
     <w:pPr>
       <w:pStyle w:val="normal1"/>
       <w:rPr/>
@@ -3037,7 +2763,7 @@
     <w:r>
       <w:rPr/>
       <w:drawing>
-        <wp:anchor xmlns:wp14="http://schemas.microsoft.com/office/word/2010/wordprocessingDrawing" distT="0" distB="0" distL="0" distR="0" simplePos="0" relativeHeight="2" behindDoc="1" locked="0" layoutInCell="0" allowOverlap="1" wp14:anchorId="6637D6F1" wp14:editId="7777777">
+        <wp:anchor behindDoc="1" distT="0" distB="0" distL="0" distR="0" simplePos="0" locked="0" layoutInCell="0" allowOverlap="1" relativeHeight="5">
           <wp:simplePos x="0" y="0"/>
           <wp:positionH relativeFrom="margin">
             <wp:align>right</wp:align>
@@ -3084,11 +2810,11 @@
       </w:drawing>
     </w:r>
   </w:p>
-  <w:p xmlns:wp14="http://schemas.microsoft.com/office/word/2010/wordml" wp14:textId="77777777">
+  <w:p>
     <w:pPr>
       <w:pStyle w:val="Normal"/>
       <w:spacing w:before="0" w:after="0"/>
-      <w:ind w:left="0" w:hanging="0"/>
+      <w:ind w:hanging="0" w:left="0"/>
       <w:jc w:val="left"/>
       <w:rPr>
         <w:spacing w:val="58"/>
@@ -3107,7 +2833,7 @@
       <w:t>EmC2  Alltagshilfe</w:t>
     </w:r>
   </w:p>
-  <w:p xmlns:wp14="http://schemas.microsoft.com/office/word/2010/wordml" wp14:textId="77777777">
+  <w:p>
     <w:pPr>
       <w:pStyle w:val="Normal"/>
       <w:spacing w:before="0" w:after="300"/>
@@ -3118,7 +2844,7 @@
       <mc:AlternateContent>
         <mc:Choice Requires="wps">
           <w:drawing>
-            <wp:inline xmlns:wp14="http://schemas.microsoft.com/office/word/2010/wordprocessingDrawing" distT="0" distB="0" distL="0" distR="0" wp14:anchorId="672D2E6F" wp14:editId="7777777">
+            <wp:inline distT="0" distB="0" distL="0" distR="0" wp14:anchorId="74C32908">
               <wp:extent cx="4807585" cy="28575"/>
               <wp:effectExtent l="0" t="0" r="0" b="0"/>
               <wp:docPr id="4" name="blue-line"/>
@@ -3155,9 +2881,9 @@
           </w:drawing>
         </mc:Choice>
         <mc:Fallback>
-          <w:pict w14:anchorId="1B87C831">
-            <v:rect id="shape_0" style="position:absolute;margin-left:0pt;margin-top:-2.3pt;width:378.5pt;height:2.2pt;mso-wrap-style:none;v-text-anchor:middle;mso-position-vertical:top" o:allowincell="f" fillcolor="#2e74b5" stroked="f" ID="blue-line" path="m0,0l-2147483645,0l-2147483645,-2147483646l0,-2147483646xe">
-              <v:fill type="solid" color2="#d18b4a" o:detectmouseclick="t"/>
+          <w:pict>
+            <v:rect id="shape_0" ID="blue-line" path="m0,0l-2147483645,0l-2147483645,-2147483646l0,-2147483646xe" fillcolor="#2e74b5" stroked="f" o:allowincell="f" style="position:absolute;margin-left:0pt;margin-top:-2.3pt;width:378.5pt;height:2.2pt;mso-wrap-style:none;v-text-anchor:middle;mso-position-vertical:top" wp14:anchorId="74C32908">
+              <v:fill o:detectmouseclick="t" type="solid" color2="#d18b4a"/>
               <v:stroke color="#3465a4" joinstyle="round" endcap="flat"/>
               <w10:wrap type="square"/>
             </v:rect>
@@ -3170,7 +2896,7 @@
 </file>
 
 <file path=word/styles.xml><?xml version="1.0" encoding="utf-8"?>
-<w:styles xmlns:wp14="http://schemas.microsoft.com/office/word/2010/wordprocessingDrawing" xmlns:w="http://schemas.openxmlformats.org/wordprocessingml/2006/main" xmlns:w14="http://schemas.microsoft.com/office/word/2010/wordml" xmlns:mc="http://schemas.openxmlformats.org/markup-compatibility/2006" mc:Ignorable="w14 wp14">
+<w:styles xmlns:w="http://schemas.openxmlformats.org/wordprocessingml/2006/main" xmlns:w14="http://schemas.microsoft.com/office/word/2010/wordml" xmlns:mc="http://schemas.openxmlformats.org/markup-compatibility/2006" mc:Ignorable="w14">
   <w:docDefaults>
     <w:rPrDefault>
       <w:rPr>
@@ -3706,7 +3432,7 @@
     <w:link w:val="Nagwek7Znak"/>
     <w:qFormat/>
     <w:pPr>
-      <w:spacing w:before="40" w:after="0" w:line="259" w:lineRule="auto"/>
+      <w:spacing w:lineRule="auto" w:line="259" w:before="40" w:after="0"/>
       <w:outlineLvl w:val="6"/>
     </w:pPr>
     <w:rPr>
@@ -3722,7 +3448,7 @@
     <w:link w:val="Nagwek8Znak"/>
     <w:qFormat/>
     <w:pPr>
-      <w:spacing w:before="40" w:after="0" w:line="259" w:lineRule="auto"/>
+      <w:spacing w:lineRule="auto" w:line="259" w:before="40" w:after="0"/>
       <w:outlineLvl w:val="7"/>
     </w:pPr>
     <w:rPr>
@@ -3738,7 +3464,7 @@
     <w:link w:val="Nagwek9Znak"/>
     <w:qFormat/>
     <w:pPr>
-      <w:spacing w:before="40" w:after="0" w:line="259" w:lineRule="auto"/>
+      <w:spacing w:lineRule="auto" w:line="259" w:before="40" w:after="0"/>
       <w:outlineLvl w:val="8"/>
     </w:pPr>
     <w:rPr>
@@ -3797,8 +3523,8 @@
       <w:sz w:val="21"/>
     </w:rPr>
   </w:style>
-  <w:style w:type="character" w:styleId="Bulletsuser">
-    <w:name w:val="Bullets (user)"/>
+  <w:style w:type="character" w:styleId="Bullets">
+    <w:name w:val="Bullets"/>
     <w:qFormat/>
     <w:rPr>
       <w:rFonts w:ascii="OpenSymbol" w:hAnsi="OpenSymbol" w:eastAsia="OpenSymbol" w:cs="OpenSymbol"/>
@@ -3823,7 +3549,7 @@
     <w:name w:val="Body Text"/>
     <w:basedOn w:val="Normal"/>
     <w:pPr>
-      <w:spacing w:before="0" w:after="140" w:line="276" w:lineRule="auto"/>
+      <w:spacing w:lineRule="auto" w:line="276" w:before="0" w:after="140"/>
     </w:pPr>
     <w:rPr/>
   </w:style>
@@ -3950,7 +3676,7 @@
     <w:unhideWhenUsed/>
     <w:qFormat/>
   </w:style>
-  <w:style w:type="table" w:styleId="Standardowy" w:default="1">
+  <w:style w:type="table" w:default="1" w:styleId="Standardowy">
     <w:name w:val="Normal Table"/>
     <w:uiPriority w:val="99"/>
     <w:semiHidden/>
@@ -3964,7 +3690,7 @@
       </w:tblCellMar>
     </w:tblPr>
   </w:style>
-  <w:style w:type="table" w:styleId="NormalTable0" w:customStyle="1">
+  <w:style w:type="table" w:customStyle="1" w:styleId="NormalTable0">
     <w:name w:val="Normal Table0"/>
     <w:tblPr>
       <w:tblCellMar>

</xml_diff>